<commit_message>
style: PDR Raporu metinleri TEKNOFEST sartnamesine gore Aptos fontuna donusturuldu
</commit_message>
<xml_diff>
--- a/PDR Aşaması/Rapor/2026_PDR_Algomed.docx
+++ b/PDR Aşaması/Rapor/2026_PDR_Algomed.docx
@@ -2588,6 +2588,7 @@
       <w:bookmarkStart w:id="0" w:name="_Toc232979038"/>
       <w:r>
         <w:rPr>
+          <w:rFonts w:ascii="Aptos" w:hAnsi="Aptos"/>
           <w:b/>
           <w:bCs/>
           <w:color w:val="000000" w:themeColor="text1"/>
@@ -2598,6 +2599,7 @@
       </w:r>
       <w:r>
         <w:rPr>
+          <w:rFonts w:ascii="Aptos" w:hAnsi="Aptos"/>
           <w:b/>
           <w:bCs/>
           <w:color w:val="000000" w:themeColor="text1"/>
@@ -2627,6 +2629,7 @@
       <w:bookmarkStart w:id="1" w:name="_Toc232979039"/>
       <w:r>
         <w:rPr>
+          <w:rFonts w:ascii="Aptos" w:hAnsi="Aptos"/>
           <w:b/>
           <w:bCs/>
           <w:color w:val="000000" w:themeColor="text1"/>
@@ -2642,6 +2645,9 @@
         <w:jc w:val="both"/>
       </w:pPr>
       <w:r>
+        <w:rPr>
+          <w:rFonts w:ascii="Aptos" w:hAnsi="Aptos"/>
+        </w:rPr>
         <w:t>Yeni nesil dizileme (NGS) teknolojilerinin milyonlarca genetik varyant üretmesi, büyük bir kısmı klinik olarak etiketlenmemiş olan bu verilerin yorumlanmasında "Variant of Uncertain Significance" (VUS) krizini ve beraberinde otomatik, güvenilir ve açıklanabilir yapay zekâ sistemlerine olan ihtiyacı doğurmuştur [1], [2]. Tek nükleotit değişimleri sonucu protein yapısını bozarak genetik hastalıklara ve kansere yol açan missense varyantların patojenite tahmini, günümüzde AL_ (evrimsel/korunmuşluk skorları), EK_ (fonksiyonel ek bilgiler), CAT_ (kategorik popülasyon/genotip bilgileri) ve AA_ (amino asit değişimleri) gibi karmaşık verileri barındıran 353 öznitelikli, yüksek boyutlu ve bol eksik değerli tablo yapıları üzerinde yürütülmektedir [1], [3]. Bu veri kümelerinde patojenik sınıfın baskın olmasından kaynaklanan keskin sınıf dengesizliği, klasik doğruluk (accuracy) metriğini tamamen işlevsiz kılmakta; modellerin başarısının F1-score, MCC ve PR-AUC gibi dengesiz verilere duyarlı metriklerle ölçülmesini zorunlu hale getirmektedir [4], [5]. Ancak bu biyoinformatik problemi sadece matematiksel bir sınıflandırma görevi değil, yanlışlıkla "benign" (zararsız) olarak etiketlenen patojenik bir varyantın (False Negative) gözden kaçarak hastada hayati riskler oluşturabileceği kritik bir klinik risk minimizasyonu problemidir; bu yüzden geliştirilecek yapay zekâ algoritmalarının maliyet fonksiyonları doğrudan klinik hataları ve False Negative oranını en aza indirecek şekilde tasarlanmalıdır [1], [6].</w:t>
       </w:r>
     </w:p>
@@ -2659,6 +2665,7 @@
       <w:bookmarkStart w:id="2" w:name="_Toc232979040"/>
       <w:r>
         <w:rPr>
+          <w:rFonts w:ascii="Aptos" w:hAnsi="Aptos"/>
           <w:b/>
           <w:bCs/>
           <w:color w:val="000000" w:themeColor="text1"/>
@@ -2669,6 +2676,7 @@
       </w:r>
       <w:r>
         <w:rPr>
+          <w:rFonts w:ascii="Aptos" w:hAnsi="Aptos"/>
           <w:b/>
           <w:bCs/>
           <w:color w:val="000000" w:themeColor="text1"/>
@@ -2684,9 +2692,15 @@
         <w:jc w:val="both"/>
       </w:pPr>
       <w:r>
+        <w:rPr>
+          <w:rFonts w:ascii="Aptos" w:hAnsi="Aptos"/>
+        </w:rPr>
         <w:t xml:space="preserve">Missense varyant patojenite tahmini problemi, yüksek boyutlu veri yapılarının yanı sıra makine öğrenmesi modellerinin kararlılığını doğrudan tehdit eden keskin bir sınıf dengesizliği (class imbalance) altında yürütülmektedir [8]. Klinik veri tabanlarında patojenik (1) ve benign (0) sınıfları arasındaki asimetrik dağılım, algoritmaların toplam hata oranını minimize etmek adına yapısal olarak çoğunluk sınıfına (patojenik sınıf) yanlılık göstermesine ve azınlık sınıfını (benign sınıf) yeterince temsil edememesine neden olmaktadır [8], [9]. Bu analitik kusur, tıp dünyasında en istenmeyen hata türü olan False Negative (FN) oranlarını artırarak aslında patojenik olan varyantların gözden kaçmasına ve tanı süreçlerinin aksamasına yol açmaktadır [10]. Bu asimetri nedeniyle, çoğunluk sınıfının ağırlığından ötürü sahte bir başarı illüzyonu yaratan klasik doğruluk (Accuracy) metriği tamamen göz ardı edilmeli; modelin gerçek başarımını ölçmek adına kesinlik (Precision) ve duyarlılık (Recall) dengesini kuran F1-Score, karmaşıklık matrisinin tüm bileşenlerini ağırlıklandıran Matthews Correlation Coefficient (MCC) ve sınıflar arası ayırt edicilik gücünü olasılıksal eğrilerle hesaplayan PR-AUC (Precision-Recall Area Under Curve) metrikleri öncelikli hedef fonksiyonu olarak benimsenmelidir [9], [11]. Literatürde bu yapısal bozulmayı engellemek amacıyla; azınlık sınıfı örnekleri arasında interpolasyon yaparak sentetik veri üreten SMOTE (Synthetic Minority Over-sampling Technique), kayıp fonksiyonunda azınlık sınıfının hatalarını daha sert penalize eden sınıf ağırlıklandırma (class weighting), yeniden örnekleme (oversampling/undersampling) ve maliyet-duyarlı öğrenme (cost-sensitive learning) yaklaşımları uygulanmaktadır [12], [13]. Bu doğrultuda, </w:t>
       </w:r>
       <w:r>
+        <w:rPr>
+          <w:rFonts w:ascii="Aptos" w:hAnsi="Aptos"/>
+        </w:rPr>
         <w:lastRenderedPageBreak/>
         <w:t>söz konusu problem yalnızca veri seviyesinde bir dengesizlik olarak değil, doğrudan klinik karar destek mekanizmalarının risk minimizasyonu stratejisi olarak ele alınmalı ve optimizasyon süreçleri F1-Score ile MCC maksimizasyonuna odaklanmalıdır [10], [12].</w:t>
       </w:r>
@@ -2705,6 +2719,7 @@
       <w:bookmarkStart w:id="3" w:name="_Toc232979041"/>
       <w:r>
         <w:rPr>
+          <w:rFonts w:ascii="Aptos" w:hAnsi="Aptos"/>
           <w:b/>
           <w:bCs/>
           <w:color w:val="000000" w:themeColor="text1"/>
@@ -2720,9 +2735,15 @@
         <w:jc w:val="both"/>
       </w:pPr>
       <w:r>
+        <w:rPr>
+          <w:rFonts w:ascii="Aptos" w:hAnsi="Aptos"/>
+        </w:rPr>
         <w:t>Genomik veri analitiği literatüründe missense varyantların patojenite tahmini, sekans tabanlı klasik istatistiksel yaklaşımlardan yapısal biyoloji destekli derin öğrenme mimarilerine doğru yapısal bir dönüşüm geçirmektedir</w:t>
       </w:r>
       <w:r>
+        <w:rPr>
+          <w:rFonts w:ascii="Aptos" w:hAnsi="Aptos"/>
+        </w:rPr>
         <w:t>. Bu süreçte geliştirilen yenilikçi yöntemler, kullanılan veri kaynakları ve elde edilen başarım ölçütleri Tablo 1'de kronolojik ve metodolojik olarak özetlenmiştir.</w:t>
       </w:r>
     </w:p>
@@ -2743,6 +2764,7 @@
       </w:pPr>
       <w:r>
         <w:rPr>
+          <w:rFonts w:ascii="Aptos" w:hAnsi="Aptos"/>
           <w:b/>
           <w:bCs/>
         </w:rPr>
@@ -2804,7 +2826,7 @@
             </w:pPr>
             <w:r>
               <w:rPr>
-                <w:rFonts w:ascii="Arial" w:eastAsia="Times New Roman" w:hAnsi="Arial" w:cs="Arial"/>
+                <w:rFonts w:ascii="Aptos" w:eastAsia="Times New Roman" w:hAnsi="Aptos" w:cs="Arial"/>
                 <w:b/>
                 <w:bCs/>
                 <w:kern w:val="0"/>
@@ -2851,7 +2873,7 @@
             </w:pPr>
             <w:r>
               <w:rPr>
-                <w:rFonts w:ascii="Arial" w:eastAsia="Times New Roman" w:hAnsi="Arial" w:cs="Arial"/>
+                <w:rFonts w:ascii="Aptos" w:eastAsia="Times New Roman" w:hAnsi="Aptos" w:cs="Arial"/>
                 <w:b/>
                 <w:bCs/>
                 <w:kern w:val="0"/>
@@ -2898,7 +2920,7 @@
             </w:pPr>
             <w:r>
               <w:rPr>
-                <w:rFonts w:ascii="Arial" w:eastAsia="Times New Roman" w:hAnsi="Arial" w:cs="Arial"/>
+                <w:rFonts w:ascii="Aptos" w:eastAsia="Times New Roman" w:hAnsi="Aptos" w:cs="Arial"/>
                 <w:b/>
                 <w:bCs/>
                 <w:kern w:val="0"/>
@@ -2945,7 +2967,7 @@
             </w:pPr>
             <w:r>
               <w:rPr>
-                <w:rFonts w:ascii="Arial" w:eastAsia="Times New Roman" w:hAnsi="Arial" w:cs="Arial"/>
+                <w:rFonts w:ascii="Aptos" w:eastAsia="Times New Roman" w:hAnsi="Aptos" w:cs="Arial"/>
                 <w:b/>
                 <w:bCs/>
                 <w:kern w:val="0"/>
@@ -2992,7 +3014,7 @@
             </w:pPr>
             <w:r>
               <w:rPr>
-                <w:rFonts w:ascii="Arial" w:eastAsia="Times New Roman" w:hAnsi="Arial" w:cs="Arial"/>
+                <w:rFonts w:ascii="Aptos" w:eastAsia="Times New Roman" w:hAnsi="Aptos" w:cs="Arial"/>
                 <w:b/>
                 <w:bCs/>
                 <w:kern w:val="0"/>
@@ -3075,7 +3097,7 @@
             </w:pPr>
             <w:r>
               <w:rPr>
-                <w:rFonts w:ascii="Arial" w:eastAsia="Times New Roman" w:hAnsi="Arial" w:cs="Arial"/>
+                <w:rFonts w:ascii="Aptos" w:eastAsia="Times New Roman" w:hAnsi="Aptos" w:cs="Arial"/>
                 <w:kern w:val="0"/>
                 <w:sz w:val="20"/>
                 <w:szCs w:val="20"/>
@@ -3117,7 +3139,7 @@
             </w:pPr>
             <w:r>
               <w:rPr>
-                <w:rFonts w:ascii="Arial" w:eastAsia="Times New Roman" w:hAnsi="Arial" w:cs="Arial"/>
+                <w:rFonts w:ascii="Aptos" w:eastAsia="Times New Roman" w:hAnsi="Aptos" w:cs="Arial"/>
                 <w:kern w:val="0"/>
                 <w:sz w:val="20"/>
                 <w:szCs w:val="20"/>
@@ -3159,7 +3181,7 @@
             </w:pPr>
             <w:r>
               <w:rPr>
-                <w:rFonts w:ascii="Arial" w:eastAsia="Times New Roman" w:hAnsi="Arial" w:cs="Arial"/>
+                <w:rFonts w:ascii="Aptos" w:eastAsia="Times New Roman" w:hAnsi="Aptos" w:cs="Arial"/>
                 <w:kern w:val="0"/>
                 <w:sz w:val="20"/>
                 <w:szCs w:val="20"/>
@@ -3201,7 +3223,7 @@
             </w:pPr>
             <w:r>
               <w:rPr>
-                <w:rFonts w:ascii="Arial" w:eastAsia="Times New Roman" w:hAnsi="Arial" w:cs="Arial"/>
+                <w:rFonts w:ascii="Aptos" w:eastAsia="Times New Roman" w:hAnsi="Aptos" w:cs="Arial"/>
                 <w:kern w:val="0"/>
                 <w:sz w:val="20"/>
                 <w:szCs w:val="20"/>
@@ -3243,7 +3265,7 @@
             </w:pPr>
             <w:r>
               <w:rPr>
-                <w:rFonts w:ascii="Arial" w:eastAsia="Times New Roman" w:hAnsi="Arial" w:cs="Arial"/>
+                <w:rFonts w:ascii="Aptos" w:eastAsia="Times New Roman" w:hAnsi="Aptos" w:cs="Arial"/>
                 <w:kern w:val="0"/>
                 <w:sz w:val="20"/>
                 <w:szCs w:val="20"/>
@@ -3321,7 +3343,7 @@
             </w:pPr>
             <w:r>
               <w:rPr>
-                <w:rFonts w:ascii="Arial" w:eastAsia="Times New Roman" w:hAnsi="Arial" w:cs="Arial"/>
+                <w:rFonts w:ascii="Aptos" w:eastAsia="Times New Roman" w:hAnsi="Aptos" w:cs="Arial"/>
                 <w:kern w:val="0"/>
                 <w:sz w:val="20"/>
                 <w:szCs w:val="20"/>
@@ -3363,7 +3385,7 @@
             </w:pPr>
             <w:r>
               <w:rPr>
-                <w:rFonts w:ascii="Arial" w:eastAsia="Times New Roman" w:hAnsi="Arial" w:cs="Arial"/>
+                <w:rFonts w:ascii="Aptos" w:eastAsia="Times New Roman" w:hAnsi="Aptos" w:cs="Arial"/>
                 <w:kern w:val="0"/>
                 <w:sz w:val="20"/>
                 <w:szCs w:val="20"/>
@@ -3374,7 +3396,7 @@
             </w:r>
             <w:r>
               <w:rPr>
-                <w:rFonts w:ascii="Arial" w:eastAsia="Times New Roman" w:hAnsi="Arial" w:cs="Arial"/>
+                <w:rFonts w:ascii="Aptos" w:eastAsia="Times New Roman" w:hAnsi="Aptos" w:cs="Arial"/>
                 <w:kern w:val="0"/>
                 <w:sz w:val="20"/>
                 <w:szCs w:val="20"/>
@@ -3385,7 +3407,7 @@
             </w:r>
             <w:r>
               <w:rPr>
-                <w:rFonts w:ascii="Arial" w:eastAsia="Times New Roman" w:hAnsi="Arial" w:cs="Arial"/>
+                <w:rFonts w:ascii="Aptos" w:eastAsia="Times New Roman" w:hAnsi="Aptos" w:cs="Arial"/>
                 <w:kern w:val="0"/>
                 <w:sz w:val="20"/>
                 <w:szCs w:val="20"/>
@@ -3427,7 +3449,7 @@
             </w:pPr>
             <w:r>
               <w:rPr>
-                <w:rFonts w:ascii="Arial" w:eastAsia="Times New Roman" w:hAnsi="Arial" w:cs="Arial"/>
+                <w:rFonts w:ascii="Aptos" w:eastAsia="Times New Roman" w:hAnsi="Aptos" w:cs="Arial"/>
                 <w:kern w:val="0"/>
                 <w:sz w:val="20"/>
                 <w:szCs w:val="20"/>
@@ -3469,7 +3491,7 @@
             </w:pPr>
             <w:r>
               <w:rPr>
-                <w:rFonts w:ascii="Arial" w:eastAsia="Times New Roman" w:hAnsi="Arial" w:cs="Arial"/>
+                <w:rFonts w:ascii="Aptos" w:eastAsia="Times New Roman" w:hAnsi="Aptos" w:cs="Arial"/>
                 <w:kern w:val="0"/>
                 <w:sz w:val="20"/>
                 <w:szCs w:val="20"/>
@@ -3480,7 +3502,7 @@
             </w:r>
             <w:r>
               <w:rPr>
-                <w:rFonts w:ascii="Arial" w:eastAsia="Times New Roman" w:hAnsi="Arial" w:cs="Arial"/>
+                <w:rFonts w:ascii="Aptos" w:eastAsia="Times New Roman" w:hAnsi="Aptos" w:cs="Arial"/>
                 <w:kern w:val="0"/>
                 <w:sz w:val="20"/>
                 <w:szCs w:val="20"/>
@@ -3491,7 +3513,7 @@
             </w:r>
             <w:r>
               <w:rPr>
-                <w:rFonts w:ascii="Arial" w:eastAsia="Times New Roman" w:hAnsi="Arial" w:cs="Arial"/>
+                <w:rFonts w:ascii="Aptos" w:eastAsia="Times New Roman" w:hAnsi="Aptos" w:cs="Arial"/>
                 <w:kern w:val="0"/>
                 <w:sz w:val="20"/>
                 <w:szCs w:val="20"/>
@@ -3533,7 +3555,7 @@
             </w:pPr>
             <w:r>
               <w:rPr>
-                <w:rFonts w:ascii="Arial" w:eastAsia="Times New Roman" w:hAnsi="Arial" w:cs="Arial"/>
+                <w:rFonts w:ascii="Aptos" w:eastAsia="Times New Roman" w:hAnsi="Aptos" w:cs="Arial"/>
                 <w:kern w:val="0"/>
                 <w:sz w:val="20"/>
                 <w:szCs w:val="20"/>
@@ -3611,7 +3633,7 @@
             </w:pPr>
             <w:r>
               <w:rPr>
-                <w:rFonts w:ascii="Arial" w:eastAsia="Times New Roman" w:hAnsi="Arial" w:cs="Arial"/>
+                <w:rFonts w:ascii="Aptos" w:eastAsia="Times New Roman" w:hAnsi="Aptos" w:cs="Arial"/>
                 <w:kern w:val="0"/>
                 <w:sz w:val="20"/>
                 <w:szCs w:val="20"/>
@@ -3653,7 +3675,7 @@
             </w:pPr>
             <w:r>
               <w:rPr>
-                <w:rFonts w:ascii="Arial" w:eastAsia="Times New Roman" w:hAnsi="Arial" w:cs="Arial"/>
+                <w:rFonts w:ascii="Aptos" w:eastAsia="Times New Roman" w:hAnsi="Aptos" w:cs="Arial"/>
                 <w:kern w:val="0"/>
                 <w:sz w:val="20"/>
                 <w:szCs w:val="20"/>
@@ -3695,7 +3717,7 @@
             </w:pPr>
             <w:r>
               <w:rPr>
-                <w:rFonts w:ascii="Arial" w:eastAsia="Times New Roman" w:hAnsi="Arial" w:cs="Arial"/>
+                <w:rFonts w:ascii="Aptos" w:eastAsia="Times New Roman" w:hAnsi="Aptos" w:cs="Arial"/>
                 <w:kern w:val="0"/>
                 <w:sz w:val="20"/>
                 <w:szCs w:val="20"/>
@@ -3737,7 +3759,7 @@
             </w:pPr>
             <w:r>
               <w:rPr>
-                <w:rFonts w:ascii="Arial" w:eastAsia="Times New Roman" w:hAnsi="Arial" w:cs="Arial"/>
+                <w:rFonts w:ascii="Aptos" w:eastAsia="Times New Roman" w:hAnsi="Aptos" w:cs="Arial"/>
                 <w:kern w:val="0"/>
                 <w:sz w:val="20"/>
                 <w:szCs w:val="20"/>
@@ -3779,7 +3801,7 @@
             </w:pPr>
             <w:r>
               <w:rPr>
-                <w:rFonts w:ascii="Arial" w:eastAsia="Times New Roman" w:hAnsi="Arial" w:cs="Arial"/>
+                <w:rFonts w:ascii="Aptos" w:eastAsia="Times New Roman" w:hAnsi="Aptos" w:cs="Arial"/>
                 <w:kern w:val="0"/>
                 <w:sz w:val="20"/>
                 <w:szCs w:val="20"/>
@@ -3857,7 +3879,7 @@
             </w:pPr>
             <w:r>
               <w:rPr>
-                <w:rFonts w:ascii="Arial" w:eastAsia="Times New Roman" w:hAnsi="Arial" w:cs="Arial"/>
+                <w:rFonts w:ascii="Aptos" w:eastAsia="Times New Roman" w:hAnsi="Aptos" w:cs="Arial"/>
                 <w:kern w:val="0"/>
                 <w:sz w:val="20"/>
                 <w:szCs w:val="20"/>
@@ -3899,7 +3921,7 @@
             </w:pPr>
             <w:r>
               <w:rPr>
-                <w:rFonts w:ascii="Arial" w:eastAsia="Times New Roman" w:hAnsi="Arial" w:cs="Arial"/>
+                <w:rFonts w:ascii="Aptos" w:eastAsia="Times New Roman" w:hAnsi="Aptos" w:cs="Arial"/>
                 <w:kern w:val="0"/>
                 <w:sz w:val="20"/>
                 <w:szCs w:val="20"/>
@@ -3941,7 +3963,7 @@
             </w:pPr>
             <w:r>
               <w:rPr>
-                <w:rFonts w:ascii="Arial" w:eastAsia="Times New Roman" w:hAnsi="Arial" w:cs="Arial"/>
+                <w:rFonts w:ascii="Aptos" w:eastAsia="Times New Roman" w:hAnsi="Aptos" w:cs="Arial"/>
                 <w:kern w:val="0"/>
                 <w:sz w:val="20"/>
                 <w:szCs w:val="20"/>
@@ -3983,7 +4005,7 @@
             </w:pPr>
             <w:r>
               <w:rPr>
-                <w:rFonts w:ascii="Arial" w:eastAsia="Times New Roman" w:hAnsi="Arial" w:cs="Arial"/>
+                <w:rFonts w:ascii="Aptos" w:eastAsia="Times New Roman" w:hAnsi="Aptos" w:cs="Arial"/>
                 <w:kern w:val="0"/>
                 <w:sz w:val="20"/>
                 <w:szCs w:val="20"/>
@@ -4025,7 +4047,7 @@
             </w:pPr>
             <w:r>
               <w:rPr>
-                <w:rFonts w:ascii="Arial" w:eastAsia="Times New Roman" w:hAnsi="Arial" w:cs="Arial"/>
+                <w:rFonts w:ascii="Aptos" w:eastAsia="Times New Roman" w:hAnsi="Aptos" w:cs="Arial"/>
                 <w:kern w:val="0"/>
                 <w:sz w:val="20"/>
                 <w:szCs w:val="20"/>
@@ -4103,7 +4125,7 @@
             </w:pPr>
             <w:r>
               <w:rPr>
-                <w:rFonts w:ascii="Arial" w:eastAsia="Times New Roman" w:hAnsi="Arial" w:cs="Arial"/>
+                <w:rFonts w:ascii="Aptos" w:eastAsia="Times New Roman" w:hAnsi="Aptos" w:cs="Arial"/>
                 <w:kern w:val="0"/>
                 <w:sz w:val="20"/>
                 <w:szCs w:val="20"/>
@@ -4145,7 +4167,7 @@
             </w:pPr>
             <w:r>
               <w:rPr>
-                <w:rFonts w:ascii="Arial" w:eastAsia="Times New Roman" w:hAnsi="Arial" w:cs="Arial"/>
+                <w:rFonts w:ascii="Aptos" w:eastAsia="Times New Roman" w:hAnsi="Aptos" w:cs="Arial"/>
                 <w:kern w:val="0"/>
                 <w:sz w:val="20"/>
                 <w:szCs w:val="20"/>
@@ -4187,7 +4209,7 @@
             </w:pPr>
             <w:r>
               <w:rPr>
-                <w:rFonts w:ascii="Arial" w:eastAsia="Times New Roman" w:hAnsi="Arial" w:cs="Arial"/>
+                <w:rFonts w:ascii="Aptos" w:eastAsia="Times New Roman" w:hAnsi="Aptos" w:cs="Arial"/>
                 <w:kern w:val="0"/>
                 <w:sz w:val="20"/>
                 <w:szCs w:val="20"/>
@@ -4198,7 +4220,7 @@
             </w:r>
             <w:r>
               <w:rPr>
-                <w:rFonts w:ascii="Arial" w:eastAsia="Times New Roman" w:hAnsi="Arial" w:cs="Arial"/>
+                <w:rFonts w:ascii="Aptos" w:eastAsia="Times New Roman" w:hAnsi="Aptos" w:cs="Arial"/>
                 <w:kern w:val="0"/>
                 <w:sz w:val="20"/>
                 <w:szCs w:val="20"/>
@@ -4209,7 +4231,7 @@
             </w:r>
             <w:r>
               <w:rPr>
-                <w:rFonts w:ascii="Arial" w:eastAsia="Times New Roman" w:hAnsi="Arial" w:cs="Arial"/>
+                <w:rFonts w:ascii="Aptos" w:eastAsia="Times New Roman" w:hAnsi="Aptos" w:cs="Arial"/>
                 <w:kern w:val="0"/>
                 <w:sz w:val="20"/>
                 <w:szCs w:val="20"/>
@@ -4251,7 +4273,7 @@
             </w:pPr>
             <w:r>
               <w:rPr>
-                <w:rFonts w:ascii="Arial" w:eastAsia="Times New Roman" w:hAnsi="Arial" w:cs="Arial"/>
+                <w:rFonts w:ascii="Aptos" w:eastAsia="Times New Roman" w:hAnsi="Aptos" w:cs="Arial"/>
                 <w:kern w:val="0"/>
                 <w:sz w:val="20"/>
                 <w:szCs w:val="20"/>
@@ -4262,7 +4284,7 @@
             </w:r>
             <w:r>
               <w:rPr>
-                <w:rFonts w:ascii="Arial" w:eastAsia="Times New Roman" w:hAnsi="Arial" w:cs="Arial"/>
+                <w:rFonts w:ascii="Aptos" w:eastAsia="Times New Roman" w:hAnsi="Aptos" w:cs="Arial"/>
                 <w:kern w:val="0"/>
                 <w:sz w:val="20"/>
                 <w:szCs w:val="20"/>
@@ -4273,7 +4295,7 @@
             </w:r>
             <w:r>
               <w:rPr>
-                <w:rFonts w:ascii="Arial" w:eastAsia="Times New Roman" w:hAnsi="Arial" w:cs="Arial"/>
+                <w:rFonts w:ascii="Aptos" w:eastAsia="Times New Roman" w:hAnsi="Aptos" w:cs="Arial"/>
                 <w:kern w:val="0"/>
                 <w:sz w:val="20"/>
                 <w:szCs w:val="20"/>
@@ -4315,7 +4337,7 @@
             </w:pPr>
             <w:r>
               <w:rPr>
-                <w:rFonts w:ascii="Arial" w:eastAsia="Times New Roman" w:hAnsi="Arial" w:cs="Arial"/>
+                <w:rFonts w:ascii="Aptos" w:eastAsia="Times New Roman" w:hAnsi="Aptos" w:cs="Arial"/>
                 <w:kern w:val="0"/>
                 <w:sz w:val="20"/>
                 <w:szCs w:val="20"/>
@@ -4393,7 +4415,7 @@
             </w:pPr>
             <w:r>
               <w:rPr>
-                <w:rFonts w:ascii="Arial" w:eastAsia="Times New Roman" w:hAnsi="Arial" w:cs="Arial"/>
+                <w:rFonts w:ascii="Aptos" w:eastAsia="Times New Roman" w:hAnsi="Aptos" w:cs="Arial"/>
                 <w:kern w:val="0"/>
                 <w:sz w:val="20"/>
                 <w:szCs w:val="20"/>
@@ -4435,7 +4457,7 @@
             </w:pPr>
             <w:r>
               <w:rPr>
-                <w:rFonts w:ascii="Arial" w:eastAsia="Times New Roman" w:hAnsi="Arial" w:cs="Arial"/>
+                <w:rFonts w:ascii="Aptos" w:eastAsia="Times New Roman" w:hAnsi="Aptos" w:cs="Arial"/>
                 <w:kern w:val="0"/>
                 <w:sz w:val="20"/>
                 <w:szCs w:val="20"/>
@@ -4477,7 +4499,7 @@
             </w:pPr>
             <w:r>
               <w:rPr>
-                <w:rFonts w:ascii="Arial" w:eastAsia="Times New Roman" w:hAnsi="Arial" w:cs="Arial"/>
+                <w:rFonts w:ascii="Aptos" w:eastAsia="Times New Roman" w:hAnsi="Aptos" w:cs="Arial"/>
                 <w:kern w:val="0"/>
                 <w:sz w:val="20"/>
                 <w:szCs w:val="20"/>
@@ -4519,7 +4541,7 @@
             </w:pPr>
             <w:r>
               <w:rPr>
-                <w:rFonts w:ascii="Arial" w:eastAsia="Times New Roman" w:hAnsi="Arial" w:cs="Arial"/>
+                <w:rFonts w:ascii="Aptos" w:eastAsia="Times New Roman" w:hAnsi="Aptos" w:cs="Arial"/>
                 <w:kern w:val="0"/>
                 <w:sz w:val="20"/>
                 <w:szCs w:val="20"/>
@@ -4561,7 +4583,7 @@
             </w:pPr>
             <w:r>
               <w:rPr>
-                <w:rFonts w:ascii="Arial" w:eastAsia="Times New Roman" w:hAnsi="Arial" w:cs="Arial"/>
+                <w:rFonts w:ascii="Aptos" w:eastAsia="Times New Roman" w:hAnsi="Aptos" w:cs="Arial"/>
                 <w:kern w:val="0"/>
                 <w:sz w:val="20"/>
                 <w:szCs w:val="20"/>
@@ -4639,7 +4661,7 @@
             </w:pPr>
             <w:r>
               <w:rPr>
-                <w:rFonts w:ascii="Arial" w:eastAsia="Times New Roman" w:hAnsi="Arial" w:cs="Arial"/>
+                <w:rFonts w:ascii="Aptos" w:eastAsia="Times New Roman" w:hAnsi="Aptos" w:cs="Arial"/>
                 <w:kern w:val="0"/>
                 <w:sz w:val="20"/>
                 <w:szCs w:val="20"/>
@@ -4681,7 +4703,7 @@
             </w:pPr>
             <w:r>
               <w:rPr>
-                <w:rFonts w:ascii="Arial" w:eastAsia="Times New Roman" w:hAnsi="Arial" w:cs="Arial"/>
+                <w:rFonts w:ascii="Aptos" w:eastAsia="Times New Roman" w:hAnsi="Aptos" w:cs="Arial"/>
                 <w:kern w:val="0"/>
                 <w:sz w:val="20"/>
                 <w:szCs w:val="20"/>
@@ -4692,7 +4714,7 @@
             </w:r>
             <w:r>
               <w:rPr>
-                <w:rFonts w:ascii="Arial" w:eastAsia="Times New Roman" w:hAnsi="Arial" w:cs="Arial"/>
+                <w:rFonts w:ascii="Aptos" w:eastAsia="Times New Roman" w:hAnsi="Aptos" w:cs="Arial"/>
                 <w:kern w:val="0"/>
                 <w:sz w:val="20"/>
                 <w:szCs w:val="20"/>
@@ -4703,7 +4725,7 @@
             </w:r>
             <w:r>
               <w:rPr>
-                <w:rFonts w:ascii="Arial" w:eastAsia="Times New Roman" w:hAnsi="Arial" w:cs="Arial"/>
+                <w:rFonts w:ascii="Aptos" w:eastAsia="Times New Roman" w:hAnsi="Aptos" w:cs="Arial"/>
                 <w:kern w:val="0"/>
                 <w:sz w:val="20"/>
                 <w:szCs w:val="20"/>
@@ -4745,7 +4767,7 @@
             </w:pPr>
             <w:r>
               <w:rPr>
-                <w:rFonts w:ascii="Arial" w:eastAsia="Times New Roman" w:hAnsi="Arial" w:cs="Arial"/>
+                <w:rFonts w:ascii="Aptos" w:eastAsia="Times New Roman" w:hAnsi="Aptos" w:cs="Arial"/>
                 <w:kern w:val="0"/>
                 <w:sz w:val="20"/>
                 <w:szCs w:val="20"/>
@@ -4756,7 +4778,7 @@
             </w:r>
             <w:r>
               <w:rPr>
-                <w:rFonts w:ascii="Arial" w:eastAsia="Times New Roman" w:hAnsi="Arial" w:cs="Arial"/>
+                <w:rFonts w:ascii="Aptos" w:eastAsia="Times New Roman" w:hAnsi="Aptos" w:cs="Arial"/>
                 <w:kern w:val="0"/>
                 <w:sz w:val="20"/>
                 <w:szCs w:val="20"/>
@@ -4767,7 +4789,7 @@
             </w:r>
             <w:r>
               <w:rPr>
-                <w:rFonts w:ascii="Arial" w:eastAsia="Times New Roman" w:hAnsi="Arial" w:cs="Arial"/>
+                <w:rFonts w:ascii="Aptos" w:eastAsia="Times New Roman" w:hAnsi="Aptos" w:cs="Arial"/>
                 <w:kern w:val="0"/>
                 <w:sz w:val="20"/>
                 <w:szCs w:val="20"/>
@@ -4809,7 +4831,7 @@
             </w:pPr>
             <w:r>
               <w:rPr>
-                <w:rFonts w:ascii="Arial" w:eastAsia="Times New Roman" w:hAnsi="Arial" w:cs="Arial"/>
+                <w:rFonts w:ascii="Aptos" w:eastAsia="Times New Roman" w:hAnsi="Aptos" w:cs="Arial"/>
                 <w:kern w:val="0"/>
                 <w:sz w:val="20"/>
                 <w:szCs w:val="20"/>
@@ -4820,7 +4842,7 @@
             </w:r>
             <w:r>
               <w:rPr>
-                <w:rFonts w:ascii="Arial" w:eastAsia="Times New Roman" w:hAnsi="Arial" w:cs="Arial"/>
+                <w:rFonts w:ascii="Aptos" w:eastAsia="Times New Roman" w:hAnsi="Aptos" w:cs="Arial"/>
                 <w:kern w:val="0"/>
                 <w:sz w:val="20"/>
                 <w:szCs w:val="20"/>
@@ -4831,7 +4853,7 @@
             </w:r>
             <w:r>
               <w:rPr>
-                <w:rFonts w:ascii="Arial" w:eastAsia="Times New Roman" w:hAnsi="Arial" w:cs="Arial"/>
+                <w:rFonts w:ascii="Aptos" w:eastAsia="Times New Roman" w:hAnsi="Aptos" w:cs="Arial"/>
                 <w:kern w:val="0"/>
                 <w:sz w:val="20"/>
                 <w:szCs w:val="20"/>
@@ -4873,7 +4895,7 @@
             </w:pPr>
             <w:r>
               <w:rPr>
-                <w:rFonts w:ascii="Arial" w:eastAsia="Times New Roman" w:hAnsi="Arial" w:cs="Arial"/>
+                <w:rFonts w:ascii="Aptos" w:eastAsia="Times New Roman" w:hAnsi="Aptos" w:cs="Arial"/>
                 <w:kern w:val="0"/>
                 <w:sz w:val="20"/>
                 <w:szCs w:val="20"/>
@@ -5121,9 +5143,15 @@
         <w:jc w:val="both"/>
       </w:pPr>
       <w:r>
+        <w:rPr>
+          <w:rFonts w:ascii="Aptos" w:hAnsi="Aptos"/>
+        </w:rPr>
         <w:t xml:space="preserve">İlk nesil araçlardan olan SIFT, protein sekanslarındaki evrimsel korunmuşluk hizalamalarını (alignment) temel alırken; PolyPhen-2 bu hizalamalara üç boyutlu protein yapısı (PDB) özelliklerini de ekleyerek sınırlı bir genellenebilirlik havuzunda ROC-AUC performansını ~0.70–0.85 bandına taşımıştır [14], [15]. Sonraki dönemde, çoklu genomik anotasyon verilerini ve bağımsız tahmin araçlarının çıktılarını meta-skorlama mekanizmalarıyla birleştiren CADD ve REVEL gibi ensemble (topluluk) öğrenme modelleri, varyant yorumlama doğruluğunu ROC-AUC ~0.90 seviyesinin üzerine çıkararak klinik laboratuvarlarda yaygın kabul görmüştür [16], [17]. Yakın dönemde ise protein katlanması ve yapısal biyolojide devrim yaratan AlphaMissense ile transformatör mimarisine dayalı Protein Dil Modelleri (ESM), manuel öznitelik mühendisliğine (feature </w:t>
       </w:r>
       <w:r>
+        <w:rPr>
+          <w:rFonts w:ascii="Aptos" w:hAnsi="Aptos"/>
+        </w:rPr>
         <w:lastRenderedPageBreak/>
         <w:t xml:space="preserve">engineering) ihtiyaç duymaksızın doğrudan sekans gösterimleri (representation learning) üzerinden ölçeklenebilir, yüksek doğruluklu klinik tahmin kapıları aramıştır [18], [19]. </w:t>
       </w:r>
@@ -5143,6 +5171,9 @@
         <w:jc w:val="both"/>
       </w:pPr>
       <w:r>
+        <w:rPr>
+          <w:rFonts w:ascii="Aptos" w:hAnsi="Aptos"/>
+        </w:rPr>
         <w:t>Güncel literatürde (2024–2026) öne çıkan AnnotateMissense gibi gradient boosting (XGBoost) tabanlı yaklaşımlar ise dbNSFP, ClinVar ve gnomAD gibi devasa veri entegrasyon havuzlarından 300'ün üzerinde fonksiyonel öznitelik türeterek ROC-AUC performansını ~0.98–0.99 seviyelerine kadar maksimize etmiştir [1], [20].</w:t>
       </w:r>
     </w:p>
@@ -5156,15 +5187,27 @@
         <w:jc w:val="both"/>
       </w:pPr>
       <w:r>
+        <w:rPr>
+          <w:rFonts w:ascii="Aptos" w:hAnsi="Aptos"/>
+        </w:rPr>
         <w:t>Ancak mevcut literatür derinlemesine incelendiğinde dört temel metodolojik boşluk (research gap) göze çarpmaktadır: Birincisi, yüksek performanslı modellerin neredeyse tamamı harici veri tabanlarına (ClinVar/gnomAD) aşırı bağımlıdır; ikincisi, eğitim ve test süreçlerinde çapraz sızıntı (data leakage) kontrolleri genellikle yetersizdir; üçüncüsü, modellerin kararları klinik karar destek süreçleri için kritik olan açıklanabilir yapay zekâ (XAI) prensiplerinden yoksundur ve son olarak, veri kümelerindeki asimetrik sınıf dengesizliği problemi algoritmik düzeyde çoğunlukla ikincil planda bırakılmıştır [14], [21]. Bu çalışmada önerilen</w:t>
       </w:r>
       <w:r>
+        <w:rPr>
+          <w:rFonts w:ascii="Aptos" w:hAnsi="Aptos"/>
+        </w:rPr>
         <w:t xml:space="preserve"> sistem ise</w:t>
       </w:r>
       <w:r>
+        <w:rPr>
+          <w:rFonts w:ascii="Aptos" w:hAnsi="Aptos"/>
+        </w:rPr>
         <w:t xml:space="preserve"> harici veri bağımlılığı olmadan sadece yarışma veri setinin özgün dinamikleriyle çalışmakta, sızıntısız bir boru hattı (leakage-free pipeline) işletmekte, biyoinformatik öznitelik mühendisliğini derinleştirerek tıp dünyasının en hassas noktası olan False Negative (FN) odaklı bir klinik risk optimizasyonu gerçekleştirmektedir [20], [21].</w:t>
       </w:r>
       <w:r>
+        <w:rPr>
+          <w:rFonts w:ascii="Aptos" w:hAnsi="Aptos"/>
+        </w:rPr>
         <w:t xml:space="preserve">Bununla birlikte, sınıf dengesizliği, veri dağılım farklılıkları ve klinik önemi bilinmeyen varyantlar (VUS) hâlen alanın temel zorlukları arasında yer almaktadır [21]. </w:t>
       </w:r>
     </w:p>
@@ -5182,6 +5225,7 @@
       <w:bookmarkStart w:id="4" w:name="_Toc232979042"/>
       <w:r>
         <w:rPr>
+          <w:rFonts w:ascii="Aptos" w:hAnsi="Aptos"/>
           <w:b/>
           <w:bCs/>
           <w:color w:val="000000" w:themeColor="text1"/>
@@ -5192,6 +5236,7 @@
       </w:r>
       <w:r>
         <w:rPr>
+          <w:rFonts w:ascii="Aptos" w:hAnsi="Aptos"/>
           <w:b/>
           <w:bCs/>
           <w:color w:val="000000" w:themeColor="text1"/>
@@ -5202,6 +5247,7 @@
       </w:r>
       <w:r>
         <w:rPr>
+          <w:rFonts w:ascii="Aptos" w:hAnsi="Aptos"/>
           <w:b/>
           <w:bCs/>
           <w:color w:val="000000" w:themeColor="text1"/>
@@ -5212,6 +5258,7 @@
       </w:r>
       <w:r>
         <w:rPr>
+          <w:rFonts w:ascii="Aptos" w:hAnsi="Aptos"/>
           <w:b/>
           <w:bCs/>
           <w:color w:val="000000" w:themeColor="text1"/>
@@ -5227,6 +5274,9 @@
         <w:jc w:val="both"/>
       </w:pPr>
       <w:r>
+        <w:rPr>
+          <w:rFonts w:ascii="Aptos" w:hAnsi="Aptos"/>
+        </w:rPr>
         <w:t xml:space="preserve">Bu bölümde missense varyant patojenite tahmini problemi için geliştirilen AlgoMed sisteminin veri işleme ve model geliştirme süreçleri bütüncül bir şekilde ele alınmaktadır. </w:t>
       </w:r>
     </w:p>
@@ -5244,6 +5294,7 @@
       <w:bookmarkStart w:id="5" w:name="_Toc232979043"/>
       <w:r>
         <w:rPr>
+          <w:rFonts w:ascii="Aptos" w:hAnsi="Aptos"/>
           <w:b/>
           <w:bCs/>
           <w:color w:val="000000" w:themeColor="text1"/>
@@ -5259,6 +5310,9 @@
         <w:jc w:val="both"/>
       </w:pPr>
       <w:r>
+        <w:rPr>
+          <w:rFonts w:ascii="Aptos" w:hAnsi="Aptos"/>
+        </w:rPr>
         <w:t>Kullanılan veri seti 353 özellikten oluşan şifreli genomik veri yapısına sahiptir. Veri; sayısal AL_ ve EK_ değişkenleri, kategorik CAT_ değişkenleri ve amino asit değişim bilgilerini içermektedir.</w:t>
       </w:r>
     </w:p>
@@ -5277,6 +5331,7 @@
       </w:pPr>
       <w:r>
         <w:rPr>
+          <w:rFonts w:ascii="Aptos" w:hAnsi="Aptos"/>
           <w:b/>
           <w:bCs/>
         </w:rPr>
@@ -5327,6 +5382,7 @@
             </w:pPr>
             <w:r>
               <w:rPr>
+                <w:rFonts w:ascii="Aptos" w:hAnsi="Aptos"/>
                 <w:b/>
                 <w:bCs/>
               </w:rPr>
@@ -5350,6 +5406,7 @@
             </w:pPr>
             <w:r>
               <w:rPr>
+                <w:rFonts w:ascii="Aptos" w:hAnsi="Aptos"/>
                 <w:b/>
                 <w:bCs/>
               </w:rPr>
@@ -5387,6 +5444,7 @@
             </w:pPr>
             <w:r>
               <w:rPr>
+                <w:rFonts w:ascii="Aptos" w:hAnsi="Aptos"/>
                 <w:b/>
                 <w:bCs/>
               </w:rPr>
@@ -5410,6 +5468,7 @@
             </w:pPr>
             <w:r>
               <w:rPr>
+                <w:rFonts w:ascii="Aptos" w:hAnsi="Aptos"/>
                 <w:b/>
                 <w:bCs/>
               </w:rPr>
@@ -5434,6 +5493,9 @@
               <w:jc w:val="both"/>
             </w:pPr>
             <w:r>
+              <w:rPr>
+                <w:rFonts w:ascii="Aptos" w:hAnsi="Aptos"/>
+              </w:rPr>
               <w:t>AL_1–AL_334</w:t>
             </w:r>
           </w:p>
@@ -5449,6 +5511,9 @@
               <w:jc w:val="both"/>
             </w:pPr>
             <w:r>
+              <w:rPr>
+                <w:rFonts w:ascii="Aptos" w:hAnsi="Aptos"/>
+              </w:rPr>
               <w:t>334</w:t>
             </w:r>
           </w:p>
@@ -5474,6 +5539,9 @@
               <w:jc w:val="both"/>
             </w:pPr>
             <w:r>
+              <w:rPr>
+                <w:rFonts w:ascii="Aptos" w:hAnsi="Aptos"/>
+              </w:rPr>
               <w:t>Sayısal</w:t>
             </w:r>
           </w:p>
@@ -5489,6 +5557,9 @@
               <w:jc w:val="both"/>
             </w:pPr>
             <w:r>
+              <w:rPr>
+                <w:rFonts w:ascii="Aptos" w:hAnsi="Aptos"/>
+              </w:rPr>
               <w:t>Şifreli genomik özellikler</w:t>
             </w:r>
           </w:p>
@@ -5510,6 +5581,9 @@
               <w:jc w:val="both"/>
             </w:pPr>
             <w:r>
+              <w:rPr>
+                <w:rFonts w:ascii="Aptos" w:hAnsi="Aptos"/>
+              </w:rPr>
               <w:t>EK_1–EK_9</w:t>
             </w:r>
           </w:p>
@@ -5525,6 +5599,9 @@
               <w:jc w:val="both"/>
             </w:pPr>
             <w:r>
+              <w:rPr>
+                <w:rFonts w:ascii="Aptos" w:hAnsi="Aptos"/>
+              </w:rPr>
               <w:t>9</w:t>
             </w:r>
           </w:p>
@@ -5550,6 +5627,9 @@
               <w:jc w:val="both"/>
             </w:pPr>
             <w:r>
+              <w:rPr>
+                <w:rFonts w:ascii="Aptos" w:hAnsi="Aptos"/>
+              </w:rPr>
               <w:t>Sayısal</w:t>
             </w:r>
           </w:p>
@@ -5565,6 +5645,9 @@
               <w:jc w:val="both"/>
             </w:pPr>
             <w:r>
+              <w:rPr>
+                <w:rFonts w:ascii="Aptos" w:hAnsi="Aptos"/>
+              </w:rPr>
               <w:t>Destekleyici biyolojik ölçümler</w:t>
             </w:r>
           </w:p>
@@ -5586,6 +5669,9 @@
               <w:jc w:val="both"/>
             </w:pPr>
             <w:r>
+              <w:rPr>
+                <w:rFonts w:ascii="Aptos" w:hAnsi="Aptos"/>
+              </w:rPr>
               <w:t>CAT_1–CAT_6</w:t>
             </w:r>
           </w:p>
@@ -5601,6 +5687,9 @@
               <w:jc w:val="both"/>
             </w:pPr>
             <w:r>
+              <w:rPr>
+                <w:rFonts w:ascii="Aptos" w:hAnsi="Aptos"/>
+              </w:rPr>
               <w:t>6</w:t>
             </w:r>
           </w:p>
@@ -5626,6 +5715,9 @@
               <w:jc w:val="both"/>
             </w:pPr>
             <w:r>
+              <w:rPr>
+                <w:rFonts w:ascii="Aptos" w:hAnsi="Aptos"/>
+              </w:rPr>
               <w:t>Kategorik</w:t>
             </w:r>
           </w:p>
@@ -5641,6 +5733,9 @@
               <w:jc w:val="both"/>
             </w:pPr>
             <w:r>
+              <w:rPr>
+                <w:rFonts w:ascii="Aptos" w:hAnsi="Aptos"/>
+              </w:rPr>
               <w:t>Popülasyon ve genotip bilgisi</w:t>
             </w:r>
           </w:p>
@@ -5662,6 +5757,9 @@
               <w:jc w:val="both"/>
             </w:pPr>
             <w:r>
+              <w:rPr>
+                <w:rFonts w:ascii="Aptos" w:hAnsi="Aptos"/>
+              </w:rPr>
               <w:t>AA_1, AA_2</w:t>
             </w:r>
           </w:p>
@@ -5677,6 +5775,9 @@
               <w:jc w:val="both"/>
             </w:pPr>
             <w:r>
+              <w:rPr>
+                <w:rFonts w:ascii="Aptos" w:hAnsi="Aptos"/>
+              </w:rPr>
               <w:t>2</w:t>
             </w:r>
           </w:p>
@@ -5702,6 +5803,9 @@
               <w:jc w:val="both"/>
             </w:pPr>
             <w:r>
+              <w:rPr>
+                <w:rFonts w:ascii="Aptos" w:hAnsi="Aptos"/>
+              </w:rPr>
               <w:t>Kategorik</w:t>
             </w:r>
           </w:p>
@@ -5717,6 +5821,9 @@
               <w:jc w:val="both"/>
             </w:pPr>
             <w:r>
+              <w:rPr>
+                <w:rFonts w:ascii="Aptos" w:hAnsi="Aptos"/>
+              </w:rPr>
               <w:t>Amino asit değişimi</w:t>
             </w:r>
           </w:p>
@@ -5738,6 +5845,9 @@
               <w:jc w:val="both"/>
             </w:pPr>
             <w:r>
+              <w:rPr>
+                <w:rFonts w:ascii="Aptos" w:hAnsi="Aptos"/>
+              </w:rPr>
               <w:t>Label</w:t>
             </w:r>
           </w:p>
@@ -5753,6 +5863,9 @@
               <w:jc w:val="both"/>
             </w:pPr>
             <w:r>
+              <w:rPr>
+                <w:rFonts w:ascii="Aptos" w:hAnsi="Aptos"/>
+              </w:rPr>
               <w:t>1</w:t>
             </w:r>
           </w:p>
@@ -5778,6 +5891,9 @@
               <w:jc w:val="both"/>
             </w:pPr>
             <w:r>
+              <w:rPr>
+                <w:rFonts w:ascii="Aptos" w:hAnsi="Aptos"/>
+              </w:rPr>
               <w:t>Binary</w:t>
             </w:r>
           </w:p>
@@ -5793,6 +5909,9 @@
               <w:jc w:val="both"/>
             </w:pPr>
             <w:r>
+              <w:rPr>
+                <w:rFonts w:ascii="Aptos" w:hAnsi="Aptos"/>
+              </w:rPr>
               <w:t>Patojenite etiketi</w:t>
             </w:r>
           </w:p>
@@ -5809,6 +5928,9 @@
         <w:jc w:val="both"/>
       </w:pPr>
       <w:r>
+        <w:rPr>
+          <w:rFonts w:ascii="Aptos" w:hAnsi="Aptos"/>
+        </w:rPr>
         <w:t>Veri yapısı yüksek eksik değer oranı ve belirgin sınıf dengesizliği içermektedir.</w:t>
       </w:r>
     </w:p>
@@ -5817,9 +5939,15 @@
         <w:jc w:val="both"/>
       </w:pPr>
       <w:r>
+        <w:rPr>
+          <w:rFonts w:ascii="Aptos" w:hAnsi="Aptos"/>
+        </w:rPr>
         <w:t xml:space="preserve">Eksik değerler veri setinden çıkarılmamış, bunun yerine modelin öğrenme sürecine dahil edilmiştir. Özellikle tıbbi verilerde eksikliğin rastgele olmadığı varsayımı dikkate alınarak </w:t>
       </w:r>
       <w:r>
+        <w:rPr>
+          <w:rFonts w:ascii="Aptos" w:hAnsi="Aptos"/>
+        </w:rPr>
         <w:lastRenderedPageBreak/>
         <w:t>Missing Indicator yaklaşımı kullanılmıştır. Bu sayede “testin yapılmamış olması” gibi klinik olarak anlam taşıyan durumlar modele bilgi olarak kazandırılmıştır.</w:t>
       </w:r>
@@ -5829,6 +5957,9 @@
         <w:jc w:val="both"/>
       </w:pPr>
       <w:r>
+        <w:rPr>
+          <w:rFonts w:ascii="Aptos" w:hAnsi="Aptos"/>
+        </w:rPr>
         <w:t>Aykırı değerler ise özellikle gradient boosting tabanlı modellerin (LightGBM, XGBoost, CatBoost) doğal dayanıklılığı sayesinde ayrı bir filtreleme işlemi gerektirmeden kontrol altına alınmıştır. Gereken durumlarda log dönüşümleri kullanılarak dağılım etkisi azaltılmıştır.</w:t>
       </w:r>
     </w:p>
@@ -5837,6 +5968,9 @@
         <w:jc w:val="both"/>
       </w:pPr>
       <w:r>
+        <w:rPr>
+          <w:rFonts w:ascii="Aptos" w:hAnsi="Aptos"/>
+        </w:rPr>
         <w:t>Veri setinden yeni özellikler üretilerek biyolojik anlamlılık artırılmıştır. Özellikle amino asit değişimlerinin protein yapısı üzerindeki etkisini modelleyebilmek için biyokimyasal dönüşümler uygulanmıştır.</w:t>
       </w:r>
     </w:p>
@@ -5855,6 +5989,7 @@
       </w:pPr>
       <w:r>
         <w:rPr>
+          <w:rFonts w:ascii="Aptos" w:hAnsi="Aptos"/>
           <w:b/>
           <w:bCs/>
         </w:rPr>
@@ -5903,6 +6038,7 @@
             </w:pPr>
             <w:r>
               <w:rPr>
+                <w:rFonts w:ascii="Aptos" w:hAnsi="Aptos"/>
                 <w:b/>
                 <w:bCs/>
               </w:rPr>
@@ -5926,6 +6062,7 @@
             </w:pPr>
             <w:r>
               <w:rPr>
+                <w:rFonts w:ascii="Aptos" w:hAnsi="Aptos"/>
                 <w:b/>
                 <w:bCs/>
               </w:rPr>
@@ -5949,6 +6086,7 @@
             </w:pPr>
             <w:r>
               <w:rPr>
+                <w:rFonts w:ascii="Aptos" w:hAnsi="Aptos"/>
                 <w:b/>
                 <w:bCs/>
               </w:rPr>
@@ -5973,6 +6111,9 @@
               <w:jc w:val="both"/>
             </w:pPr>
             <w:r>
+              <w:rPr>
+                <w:rFonts w:ascii="Aptos" w:hAnsi="Aptos"/>
+              </w:rPr>
               <w:t>Amino asit polarite farkı</w:t>
             </w:r>
           </w:p>
@@ -5988,6 +6129,9 @@
               <w:jc w:val="both"/>
             </w:pPr>
             <w:r>
+              <w:rPr>
+                <w:rFonts w:ascii="Aptos" w:hAnsi="Aptos"/>
+              </w:rPr>
               <w:t>AA değişimlerinin kimyasal yapısı</w:t>
             </w:r>
           </w:p>
@@ -6003,6 +6147,9 @@
               <w:jc w:val="both"/>
             </w:pPr>
             <w:r>
+              <w:rPr>
+                <w:rFonts w:ascii="Aptos" w:hAnsi="Aptos"/>
+              </w:rPr>
               <w:t>Protein stabilitesi</w:t>
             </w:r>
           </w:p>
@@ -6024,6 +6171,9 @@
               <w:jc w:val="both"/>
             </w:pPr>
             <w:r>
+              <w:rPr>
+                <w:rFonts w:ascii="Aptos" w:hAnsi="Aptos"/>
+              </w:rPr>
               <w:t>Hidrofobiklik değişimi</w:t>
             </w:r>
           </w:p>
@@ -6039,6 +6189,9 @@
               <w:jc w:val="both"/>
             </w:pPr>
             <w:r>
+              <w:rPr>
+                <w:rFonts w:ascii="Aptos" w:hAnsi="Aptos"/>
+              </w:rPr>
               <w:t>Su etkileşim farkı</w:t>
             </w:r>
           </w:p>
@@ -6054,6 +6207,9 @@
               <w:jc w:val="both"/>
             </w:pPr>
             <w:r>
+              <w:rPr>
+                <w:rFonts w:ascii="Aptos" w:hAnsi="Aptos"/>
+              </w:rPr>
               <w:t>Yapısal bozulma</w:t>
             </w:r>
           </w:p>
@@ -6075,6 +6231,9 @@
               <w:jc w:val="both"/>
             </w:pPr>
             <w:r>
+              <w:rPr>
+                <w:rFonts w:ascii="Aptos" w:hAnsi="Aptos"/>
+              </w:rPr>
               <w:t>Moleküler ağırlık farkı</w:t>
             </w:r>
           </w:p>
@@ -6090,6 +6249,9 @@
               <w:jc w:val="both"/>
             </w:pPr>
             <w:r>
+              <w:rPr>
+                <w:rFonts w:ascii="Aptos" w:hAnsi="Aptos"/>
+              </w:rPr>
               <w:t>Fiziksel değişim</w:t>
             </w:r>
           </w:p>
@@ -6105,6 +6267,9 @@
               <w:jc w:val="both"/>
             </w:pPr>
             <w:r>
+              <w:rPr>
+                <w:rFonts w:ascii="Aptos" w:hAnsi="Aptos"/>
+              </w:rPr>
               <w:t>Fonksiyon kaybı</w:t>
             </w:r>
           </w:p>
@@ -6126,6 +6291,9 @@
               <w:jc w:val="both"/>
             </w:pPr>
             <w:r>
+              <w:rPr>
+                <w:rFonts w:ascii="Aptos" w:hAnsi="Aptos"/>
+              </w:rPr>
               <w:t>Grantham distance</w:t>
             </w:r>
           </w:p>
@@ -6141,6 +6309,9 @@
               <w:jc w:val="both"/>
             </w:pPr>
             <w:r>
+              <w:rPr>
+                <w:rFonts w:ascii="Aptos" w:hAnsi="Aptos"/>
+              </w:rPr>
               <w:t>Mutasyon şiddeti</w:t>
             </w:r>
           </w:p>
@@ -6156,6 +6327,9 @@
               <w:jc w:val="both"/>
             </w:pPr>
             <w:r>
+              <w:rPr>
+                <w:rFonts w:ascii="Aptos" w:hAnsi="Aptos"/>
+              </w:rPr>
               <w:t>Klinik etki ölçümü</w:t>
             </w:r>
           </w:p>
@@ -6177,6 +6351,9 @@
               <w:jc w:val="both"/>
             </w:pPr>
             <w:r>
+              <w:rPr>
+                <w:rFonts w:ascii="Aptos" w:hAnsi="Aptos"/>
+              </w:rPr>
               <w:t>Feature interaction</w:t>
             </w:r>
           </w:p>
@@ -6192,12 +6369,21 @@
               <w:jc w:val="both"/>
             </w:pPr>
             <w:r>
+              <w:rPr>
+                <w:rFonts w:ascii="Aptos" w:hAnsi="Aptos"/>
+              </w:rPr>
               <w:t xml:space="preserve">AL </w:t>
             </w:r>
             <w:r>
+              <w:rPr>
+                <w:rFonts w:ascii="Aptos" w:hAnsi="Aptos"/>
+              </w:rPr>
               <w:t>ve</w:t>
             </w:r>
             <w:r>
+              <w:rPr>
+                <w:rFonts w:ascii="Aptos" w:hAnsi="Aptos"/>
+              </w:rPr>
               <w:t xml:space="preserve"> EK ilişkileri</w:t>
             </w:r>
           </w:p>
@@ -6213,6 +6399,9 @@
               <w:jc w:val="both"/>
             </w:pPr>
             <w:r>
+              <w:rPr>
+                <w:rFonts w:ascii="Aptos" w:hAnsi="Aptos"/>
+              </w:rPr>
               <w:t>Non-lineer yapı yakalama</w:t>
             </w:r>
           </w:p>
@@ -6234,6 +6423,9 @@
               <w:jc w:val="both"/>
             </w:pPr>
             <w:r>
+              <w:rPr>
+                <w:rFonts w:ascii="Aptos" w:hAnsi="Aptos"/>
+              </w:rPr>
               <w:t>PCA bileşenleri</w:t>
             </w:r>
           </w:p>
@@ -6249,6 +6441,9 @@
               <w:jc w:val="both"/>
             </w:pPr>
             <w:r>
+              <w:rPr>
+                <w:rFonts w:ascii="Aptos" w:hAnsi="Aptos"/>
+              </w:rPr>
               <w:t>Boyut indirgeme</w:t>
             </w:r>
           </w:p>
@@ -6264,6 +6459,9 @@
               <w:jc w:val="both"/>
             </w:pPr>
             <w:r>
+              <w:rPr>
+                <w:rFonts w:ascii="Aptos" w:hAnsi="Aptos"/>
+              </w:rPr>
               <w:t>Gürültü azaltma</w:t>
             </w:r>
           </w:p>
@@ -6285,6 +6483,9 @@
               <w:jc w:val="both"/>
             </w:pPr>
             <w:r>
+              <w:rPr>
+                <w:rFonts w:ascii="Aptos" w:hAnsi="Aptos"/>
+              </w:rPr>
               <w:t>Cluster ID</w:t>
             </w:r>
           </w:p>
@@ -6300,6 +6501,9 @@
               <w:jc w:val="both"/>
             </w:pPr>
             <w:r>
+              <w:rPr>
+                <w:rFonts w:ascii="Aptos" w:hAnsi="Aptos"/>
+              </w:rPr>
               <w:t>K-Means sonucu</w:t>
             </w:r>
           </w:p>
@@ -6315,6 +6519,9 @@
               <w:jc w:val="both"/>
             </w:pPr>
             <w:r>
+              <w:rPr>
+                <w:rFonts w:ascii="Aptos" w:hAnsi="Aptos"/>
+              </w:rPr>
               <w:t>Gizli yapı keşfi</w:t>
             </w:r>
           </w:p>
@@ -6331,6 +6538,9 @@
         <w:jc w:val="both"/>
       </w:pPr>
       <w:r>
+        <w:rPr>
+          <w:rFonts w:ascii="Aptos" w:hAnsi="Aptos"/>
+        </w:rPr>
         <w:t>Çalışmada ClinVar, gnomAD veya benzeri dış veri kaynakları kullanılmamıştır. Bu tercih, veri sızıntısı riskini ortadan kaldırmak ve modelin yalnızca verilen kapalı veri üzerinde öğrenmesini sağlamak amacıyla yapılmıştır.</w:t>
       </w:r>
     </w:p>
@@ -6353,6 +6563,7 @@
       <w:bookmarkStart w:id="6" w:name="_Toc232979044"/>
       <w:r>
         <w:rPr>
+          <w:rFonts w:ascii="Aptos" w:hAnsi="Aptos"/>
           <w:b/>
           <w:bCs/>
           <w:color w:val="000000" w:themeColor="text1"/>
@@ -6363,6 +6574,7 @@
       </w:r>
       <w:r>
         <w:rPr>
+          <w:rFonts w:ascii="Aptos" w:hAnsi="Aptos"/>
           <w:b/>
           <w:bCs/>
           <w:color w:val="000000" w:themeColor="text1"/>
@@ -6378,6 +6590,9 @@
         <w:jc w:val="both"/>
       </w:pPr>
       <w:r>
+        <w:rPr>
+          <w:rFonts w:ascii="Aptos" w:hAnsi="Aptos"/>
+        </w:rPr>
         <w:t>Model geliştirme sürecinde üç ana gradient boosting algoritması kullanılmıştır: LightGBM, XGBoost ve CatBoost. Bu modellerin tercih edilme nedeni; yüksek boyutlu verilerde güçlü performans göstermeleri, sınıf dengesizliğine karşı dayanıklı olmaları ve farklı hata yapma davranışlarına sahip olmalarıdır.</w:t>
       </w:r>
     </w:p>
@@ -6386,6 +6601,9 @@
         <w:jc w:val="both"/>
       </w:pPr>
       <w:r>
+        <w:rPr>
+          <w:rFonts w:ascii="Aptos" w:hAnsi="Aptos"/>
+        </w:rPr>
         <w:t>Bu modeller stacking ensemble yapısı içinde birleştirilerek daha güçlü bir tahmin yapısı oluşturulmuştur. Meta model olarak Logistic Regression kullanılmıştır.</w:t>
       </w:r>
     </w:p>
@@ -6399,6 +6617,9 @@
         <w:jc w:val="both"/>
       </w:pPr>
       <w:r>
+        <w:rPr>
+          <w:rFonts w:ascii="Aptos" w:hAnsi="Aptos"/>
+        </w:rPr>
         <w:t>Model parametreleri Optuna framework kullanılarak optimize edilmiştir. Bayesian optimization (TPE sampler) yöntemi tercih edilerek daha az denemeyle daha yüksek performanslı parametre kombinasyonlarına ulaşılması sağlanmıştır.</w:t>
       </w:r>
     </w:p>
@@ -6421,6 +6642,7 @@
       </w:pPr>
       <w:r>
         <w:rPr>
+          <w:rFonts w:ascii="Aptos" w:hAnsi="Aptos"/>
           <w:b/>
           <w:bCs/>
         </w:rPr>
@@ -6468,6 +6690,7 @@
             </w:pPr>
             <w:r>
               <w:rPr>
+                <w:rFonts w:ascii="Aptos" w:hAnsi="Aptos"/>
                 <w:b/>
                 <w:bCs/>
               </w:rPr>
@@ -6491,6 +6714,7 @@
             </w:pPr>
             <w:r>
               <w:rPr>
+                <w:rFonts w:ascii="Aptos" w:hAnsi="Aptos"/>
                 <w:b/>
                 <w:bCs/>
               </w:rPr>
@@ -6515,6 +6739,9 @@
               <w:jc w:val="both"/>
             </w:pPr>
             <w:r>
+              <w:rPr>
+                <w:rFonts w:ascii="Aptos" w:hAnsi="Aptos"/>
+              </w:rPr>
               <w:t>Yöntem</w:t>
             </w:r>
           </w:p>
@@ -6530,6 +6757,9 @@
               <w:jc w:val="both"/>
             </w:pPr>
             <w:r>
+              <w:rPr>
+                <w:rFonts w:ascii="Aptos" w:hAnsi="Aptos"/>
+              </w:rPr>
               <w:t>Optuna (TPE)</w:t>
             </w:r>
           </w:p>
@@ -6551,6 +6781,9 @@
               <w:jc w:val="both"/>
             </w:pPr>
             <w:r>
+              <w:rPr>
+                <w:rFonts w:ascii="Aptos" w:hAnsi="Aptos"/>
+              </w:rPr>
               <w:t>Deneme sayısı</w:t>
             </w:r>
           </w:p>
@@ -6566,6 +6799,9 @@
               <w:jc w:val="both"/>
             </w:pPr>
             <w:r>
+              <w:rPr>
+                <w:rFonts w:ascii="Aptos" w:hAnsi="Aptos"/>
+              </w:rPr>
               <w:t>500–1000</w:t>
             </w:r>
           </w:p>
@@ -6587,6 +6823,9 @@
               <w:jc w:val="both"/>
             </w:pPr>
             <w:r>
+              <w:rPr>
+                <w:rFonts w:ascii="Aptos" w:hAnsi="Aptos"/>
+              </w:rPr>
               <w:t>Amaç fonksiyonu</w:t>
             </w:r>
           </w:p>
@@ -6602,6 +6841,9 @@
               <w:jc w:val="both"/>
             </w:pPr>
             <w:r>
+              <w:rPr>
+                <w:rFonts w:ascii="Aptos" w:hAnsi="Aptos"/>
+              </w:rPr>
               <w:t>F1-score</w:t>
             </w:r>
           </w:p>
@@ -6623,13 +6865,22 @@
               <w:jc w:val="both"/>
             </w:pPr>
             <w:r>
+              <w:rPr>
+                <w:rFonts w:ascii="Aptos" w:hAnsi="Aptos"/>
+              </w:rPr>
               <w:lastRenderedPageBreak/>
               <w:t>Optimize</w:t>
             </w:r>
             <w:r>
+              <w:rPr>
+                <w:rFonts w:ascii="Aptos" w:hAnsi="Aptos"/>
+              </w:rPr>
               <w:t xml:space="preserve"> </w:t>
             </w:r>
             <w:r>
+              <w:rPr>
+                <w:rFonts w:ascii="Aptos" w:hAnsi="Aptos"/>
+              </w:rPr>
               <w:t>edilen parametreler</w:t>
             </w:r>
           </w:p>
@@ -6645,6 +6896,9 @@
               <w:jc w:val="both"/>
             </w:pPr>
             <w:r>
+              <w:rPr>
+                <w:rFonts w:ascii="Aptos" w:hAnsi="Aptos"/>
+              </w:rPr>
               <w:t>learning_rate, max_depth, n_estimators, subsample, scale_pos_weight</w:t>
             </w:r>
           </w:p>
@@ -6656,6 +6910,9 @@
         <w:jc w:val="both"/>
       </w:pPr>
       <w:r>
+        <w:rPr>
+          <w:rFonts w:ascii="Aptos" w:hAnsi="Aptos"/>
+        </w:rPr>
         <w:t>Model değerlendirmesinde K-Fold Cross Validation kullanılmıştır. Tüm veri işleme adımları pipeline içine alınarak her fold için bağımsız eğitim yapılmıştır.</w:t>
       </w:r>
     </w:p>
@@ -6664,6 +6921,9 @@
         <w:jc w:val="both"/>
       </w:pPr>
       <w:r>
+        <w:rPr>
+          <w:rFonts w:ascii="Aptos" w:hAnsi="Aptos"/>
+        </w:rPr>
         <w:t>Aşırı uyum riskini azaltmak için Out-of-Fold (OOF) stacking yaklaşımı, regularization (L1/L2), early stopping ve SMOTE’un yalnızca training fold içinde uygulanması gibi yöntemler kullanılmıştır.</w:t>
       </w:r>
     </w:p>
@@ -6672,6 +6932,9 @@
         <w:jc w:val="both"/>
       </w:pPr>
       <w:r>
+        <w:rPr>
+          <w:rFonts w:ascii="Aptos" w:hAnsi="Aptos"/>
+        </w:rPr>
         <w:t>Veri setindeki ciddi sınıf dengesizliği nedeniyle SMOTE, class weighting ve threshold optimization yöntemleri birlikte kullanılmıştır. Özellikle SMOTE işlemi yalnızca eğitim katmanında uygulanarak veri sızıntısı engellenmiştir.</w:t>
       </w:r>
     </w:p>
@@ -6680,6 +6943,9 @@
         <w:jc w:val="both"/>
       </w:pPr>
       <w:r>
+        <w:rPr>
+          <w:rFonts w:ascii="Aptos" w:hAnsi="Aptos"/>
+        </w:rPr>
         <w:t>Model başarımı klinik açıdan anlamlı metriklerle değerlendirilmiştir. Accuracy metriği tek başına kullanılmamış, bunun yerine aşağıdaki metrikler tercih edilmiştir:</w:t>
       </w:r>
     </w:p>
@@ -6692,6 +6958,9 @@
         <w:jc w:val="both"/>
       </w:pPr>
       <w:r>
+        <w:rPr>
+          <w:rFonts w:ascii="Aptos" w:hAnsi="Aptos"/>
+        </w:rPr>
         <w:t>F1-score (ana metrik)</w:t>
       </w:r>
     </w:p>
@@ -6704,6 +6973,9 @@
         <w:jc w:val="both"/>
       </w:pPr>
       <w:r>
+        <w:rPr>
+          <w:rFonts w:ascii="Aptos" w:hAnsi="Aptos"/>
+        </w:rPr>
         <w:t>Matthews Correlation Coefficient (MCC)</w:t>
       </w:r>
     </w:p>
@@ -6716,6 +6988,9 @@
         <w:jc w:val="both"/>
       </w:pPr>
       <w:r>
+        <w:rPr>
+          <w:rFonts w:ascii="Aptos" w:hAnsi="Aptos"/>
+        </w:rPr>
         <w:t>Precision-Recall AUC (PR-AUC)</w:t>
       </w:r>
     </w:p>
@@ -6728,6 +7003,9 @@
         <w:jc w:val="both"/>
       </w:pPr>
       <w:r>
+        <w:rPr>
+          <w:rFonts w:ascii="Aptos" w:hAnsi="Aptos"/>
+        </w:rPr>
         <w:t>ROC-AUC</w:t>
       </w:r>
     </w:p>
@@ -6736,6 +7014,9 @@
         <w:jc w:val="both"/>
       </w:pPr>
       <w:r>
+        <w:rPr>
+          <w:rFonts w:ascii="Aptos" w:hAnsi="Aptos"/>
+        </w:rPr>
         <w:t>Bu metrikler özellikle dengesiz veri yapılarında modelin gerçek performansını daha doğru yansıtmaktadır.</w:t>
       </w:r>
     </w:p>
@@ -6744,6 +7025,9 @@
         <w:jc w:val="both"/>
       </w:pPr>
       <w:r>
+        <w:rPr>
+          <w:rFonts w:ascii="Aptos" w:hAnsi="Aptos"/>
+        </w:rPr>
         <w:t>Model kararlarının klinik olarak yorumlanabilmesi için SHAP (SHapley Additive exPlanations) yöntemi kullanılmıştır. SHAP analizi sayesinde her bir özelliğin model kararına katkısı hem global hem de lokal düzeyde incelenmiştir.</w:t>
       </w:r>
     </w:p>
@@ -6754,6 +7038,7 @@
       </w:pPr>
       <w:r>
         <w:rPr>
+          <w:rFonts w:ascii="Aptos" w:hAnsi="Aptos"/>
           <w:noProof/>
         </w:rPr>
         <w:drawing>
@@ -6799,6 +7084,7 @@
       </w:pPr>
       <w:r>
         <w:rPr>
+          <w:rFonts w:ascii="Aptos" w:hAnsi="Aptos"/>
           <w:b/>
           <w:sz w:val="20"/>
         </w:rPr>
@@ -6811,6 +7097,7 @@
       </w:pPr>
       <w:r>
         <w:rPr>
+          <w:rFonts w:ascii="Aptos" w:hAnsi="Aptos"/>
           <w:i/>
           <w:sz w:val="18"/>
         </w:rPr>
@@ -6823,6 +7110,9 @@
         <w:jc w:val="both"/>
       </w:pPr>
       <w:r>
+        <w:rPr>
+          <w:rFonts w:ascii="Aptos" w:hAnsi="Aptos"/>
+        </w:rPr>
         <w:t>Sınıf dengesizliği nedeniyle standart 0.5 eşik değeri kullanılmamıştır. Bunun yerine Precision-Recall eğrisi ve False Negative minimizasyonu temel alınarak optimal eşik değerleri belirlenmiştir. Bu yaklaşım özellikle patojenik varyantların kaçırılmasını azaltmayı hedeflemektedir.</w:t>
       </w:r>
     </w:p>
@@ -6840,6 +7130,7 @@
       <w:bookmarkStart w:id="7" w:name="_Toc232979045"/>
       <w:r>
         <w:rPr>
+          <w:rFonts w:ascii="Aptos" w:hAnsi="Aptos"/>
           <w:b/>
           <w:bCs/>
           <w:color w:val="000000" w:themeColor="text1"/>
@@ -6851,6 +7142,7 @@
       <w:bookmarkEnd w:id="7"/>
       <w:r>
         <w:rPr>
+          <w:rFonts w:ascii="Aptos" w:hAnsi="Aptos"/>
           <w:b/>
           <w:bCs/>
           <w:color w:val="000000" w:themeColor="text1"/>
@@ -6862,12 +7154,21 @@
     </w:p>
     <w:p>
       <w:r>
+        <w:rPr>
+          <w:rFonts w:ascii="Aptos" w:hAnsi="Aptos"/>
+        </w:rPr>
         <w:t xml:space="preserve">Bu bölümde, geliştirilen modellerin tüm versiyonlara (V1–V7) ait performansları ve en iyi konfigürasyonun (V7) detaylı sonuçları nesnel metrikler üzerinden sunulmaktadır. Değerlendirme; </w:t>
       </w:r>
       <w:r>
+        <w:rPr>
+          <w:rFonts w:ascii="Aptos" w:hAnsi="Aptos"/>
+        </w:rPr>
         <w:t>F1 skoru, Matthews Korelasyon Katsayısı (MCC), PR-AUC ve ROC-AUC</w:t>
       </w:r>
       <w:r>
+        <w:rPr>
+          <w:rFonts w:ascii="Aptos" w:hAnsi="Aptos"/>
+        </w:rPr>
         <w:t xml:space="preserve"> metrikleri ile gerçekleştirilmiştir. Tüm sonuçlar 5-Fold Stratified Cross-Validation üzerinden raporlanmıştır.</w:t>
       </w:r>
     </w:p>
@@ -6881,6 +7182,7 @@
       </w:pPr>
       <w:r>
         <w:rPr>
+          <w:rFonts w:ascii="Aptos" w:hAnsi="Aptos"/>
           <w:b/>
           <w:bCs/>
         </w:rPr>
@@ -6888,6 +7190,7 @@
       </w:r>
       <w:r>
         <w:rPr>
+          <w:rFonts w:ascii="Aptos" w:hAnsi="Aptos"/>
           <w:b/>
           <w:bCs/>
         </w:rPr>
@@ -6901,6 +7204,7 @@
       </w:pPr>
       <w:r>
         <w:rPr>
+          <w:rFonts w:ascii="Aptos" w:hAnsi="Aptos"/>
           <w:noProof/>
         </w:rPr>
         <w:drawing>
@@ -6946,6 +7250,7 @@
       </w:pPr>
       <w:r>
         <w:rPr>
+          <w:rFonts w:ascii="Aptos" w:hAnsi="Aptos"/>
           <w:b/>
           <w:sz w:val="20"/>
         </w:rPr>
@@ -6958,6 +7263,7 @@
       </w:pPr>
       <w:r>
         <w:rPr>
+          <w:rFonts w:ascii="Aptos" w:hAnsi="Aptos"/>
           <w:i/>
           <w:sz w:val="18"/>
         </w:rPr>
@@ -7008,6 +7314,7 @@
             </w:pPr>
             <w:r>
               <w:rPr>
+                <w:rFonts w:ascii="Aptos" w:hAnsi="Aptos"/>
                 <w:b/>
                 <w:bCs/>
               </w:rPr>
@@ -7030,6 +7337,7 @@
             </w:pPr>
             <w:r>
               <w:rPr>
+                <w:rFonts w:ascii="Aptos" w:hAnsi="Aptos"/>
                 <w:b/>
                 <w:bCs/>
               </w:rPr>
@@ -7052,6 +7360,7 @@
             </w:pPr>
             <w:r>
               <w:rPr>
+                <w:rFonts w:ascii="Aptos" w:hAnsi="Aptos"/>
                 <w:b/>
                 <w:bCs/>
               </w:rPr>
@@ -7074,6 +7383,7 @@
             </w:pPr>
             <w:r>
               <w:rPr>
+                <w:rFonts w:ascii="Aptos" w:hAnsi="Aptos"/>
                 <w:b/>
                 <w:bCs/>
               </w:rPr>
@@ -7096,6 +7406,7 @@
             </w:pPr>
             <w:r>
               <w:rPr>
+                <w:rFonts w:ascii="Aptos" w:hAnsi="Aptos"/>
                 <w:b/>
                 <w:bCs/>
               </w:rPr>
@@ -7118,6 +7429,7 @@
             </w:pPr>
             <w:r>
               <w:rPr>
+                <w:rFonts w:ascii="Aptos" w:hAnsi="Aptos"/>
                 <w:b/>
                 <w:bCs/>
               </w:rPr>
@@ -7138,6 +7450,9 @@
           </w:tcPr>
           <w:p>
             <w:r>
+              <w:rPr>
+                <w:rFonts w:ascii="Aptos" w:hAnsi="Aptos"/>
+              </w:rPr>
               <w:t>V1</w:t>
             </w:r>
           </w:p>
@@ -7150,6 +7465,9 @@
           </w:tcPr>
           <w:p>
             <w:r>
+              <w:rPr>
+                <w:rFonts w:ascii="Aptos" w:hAnsi="Aptos"/>
+              </w:rPr>
               <w:t>LGB + XGB (Soft Voting)</w:t>
             </w:r>
           </w:p>
@@ -7162,6 +7480,9 @@
           </w:tcPr>
           <w:p>
             <w:r>
+              <w:rPr>
+                <w:rFonts w:ascii="Aptos" w:hAnsi="Aptos"/>
+              </w:rPr>
               <w:t>0.8711</w:t>
             </w:r>
           </w:p>
@@ -7174,6 +7495,9 @@
           </w:tcPr>
           <w:p>
             <w:r>
+              <w:rPr>
+                <w:rFonts w:ascii="Aptos" w:hAnsi="Aptos"/>
+              </w:rPr>
               <w:t>0.5054</w:t>
             </w:r>
           </w:p>
@@ -7186,6 +7510,9 @@
           </w:tcPr>
           <w:p>
             <w:r>
+              <w:rPr>
+                <w:rFonts w:ascii="Aptos" w:hAnsi="Aptos"/>
+              </w:rPr>
               <w:t>0.9207</w:t>
             </w:r>
           </w:p>
@@ -7198,6 +7525,9 @@
           </w:tcPr>
           <w:p>
             <w:r>
+              <w:rPr>
+                <w:rFonts w:ascii="Aptos" w:hAnsi="Aptos"/>
+              </w:rPr>
               <w:t>0.8372</w:t>
             </w:r>
           </w:p>
@@ -7215,6 +7545,9 @@
           </w:tcPr>
           <w:p>
             <w:r>
+              <w:rPr>
+                <w:rFonts w:ascii="Aptos" w:hAnsi="Aptos"/>
+              </w:rPr>
               <w:t>V2</w:t>
             </w:r>
           </w:p>
@@ -7227,6 +7560,9 @@
           </w:tcPr>
           <w:p>
             <w:r>
+              <w:rPr>
+                <w:rFonts w:ascii="Aptos" w:hAnsi="Aptos"/>
+              </w:rPr>
               <w:t>Missing Indicator + Threshold Opt.</w:t>
             </w:r>
           </w:p>
@@ -7239,6 +7575,9 @@
           </w:tcPr>
           <w:p>
             <w:r>
+              <w:rPr>
+                <w:rFonts w:ascii="Aptos" w:hAnsi="Aptos"/>
+              </w:rPr>
               <w:t>0.8903</w:t>
             </w:r>
           </w:p>
@@ -7251,6 +7590,9 @@
           </w:tcPr>
           <w:p>
             <w:r>
+              <w:rPr>
+                <w:rFonts w:ascii="Aptos" w:hAnsi="Aptos"/>
+              </w:rPr>
               <w:t>0.5301</w:t>
             </w:r>
           </w:p>
@@ -7263,6 +7605,9 @@
           </w:tcPr>
           <w:p>
             <w:r>
+              <w:rPr>
+                <w:rFonts w:ascii="Aptos" w:hAnsi="Aptos"/>
+              </w:rPr>
               <w:t>0.9206</w:t>
             </w:r>
           </w:p>
@@ -7275,6 +7620,9 @@
           </w:tcPr>
           <w:p>
             <w:r>
+              <w:rPr>
+                <w:rFonts w:ascii="Aptos" w:hAnsi="Aptos"/>
+              </w:rPr>
               <w:t>0.8392</w:t>
             </w:r>
           </w:p>
@@ -7292,6 +7640,9 @@
           </w:tcPr>
           <w:p>
             <w:r>
+              <w:rPr>
+                <w:rFonts w:ascii="Aptos" w:hAnsi="Aptos"/>
+              </w:rPr>
               <w:t>V3</w:t>
             </w:r>
           </w:p>
@@ -7304,6 +7655,9 @@
           </w:tcPr>
           <w:p>
             <w:r>
+              <w:rPr>
+                <w:rFonts w:ascii="Aptos" w:hAnsi="Aptos"/>
+              </w:rPr>
               <w:t>Biochem AA + Optuna + SHAP Top-100</w:t>
             </w:r>
           </w:p>
@@ -7316,6 +7670,9 @@
           </w:tcPr>
           <w:p>
             <w:r>
+              <w:rPr>
+                <w:rFonts w:ascii="Aptos" w:hAnsi="Aptos"/>
+              </w:rPr>
               <w:t>0.8929</w:t>
             </w:r>
           </w:p>
@@ -7328,6 +7685,9 @@
           </w:tcPr>
           <w:p>
             <w:r>
+              <w:rPr>
+                <w:rFonts w:ascii="Aptos" w:hAnsi="Aptos"/>
+              </w:rPr>
               <w:t>0.5401</w:t>
             </w:r>
           </w:p>
@@ -7340,9 +7700,15 @@
           </w:tcPr>
           <w:p>
             <w:r>
+              <w:rPr>
+                <w:rFonts w:ascii="Aptos" w:hAnsi="Aptos"/>
+              </w:rPr>
               <w:t xml:space="preserve"> </w:t>
             </w:r>
             <w:r>
+              <w:rPr>
+                <w:rFonts w:ascii="Aptos" w:hAnsi="Aptos"/>
+              </w:rPr>
               <w:t>—</w:t>
             </w:r>
           </w:p>
@@ -7355,6 +7721,9 @@
           </w:tcPr>
           <w:p>
             <w:r>
+              <w:rPr>
+                <w:rFonts w:ascii="Aptos" w:hAnsi="Aptos"/>
+              </w:rPr>
               <w:t>—</w:t>
             </w:r>
           </w:p>
@@ -7372,6 +7741,9 @@
           </w:tcPr>
           <w:p>
             <w:r>
+              <w:rPr>
+                <w:rFonts w:ascii="Aptos" w:hAnsi="Aptos"/>
+              </w:rPr>
               <w:t>V4</w:t>
             </w:r>
           </w:p>
@@ -7384,6 +7756,9 @@
           </w:tcPr>
           <w:p>
             <w:r>
+              <w:rPr>
+                <w:rFonts w:ascii="Aptos" w:hAnsi="Aptos"/>
+              </w:rPr>
               <w:t>CatBoost + Stacking + EK Interaction</w:t>
             </w:r>
           </w:p>
@@ -7396,6 +7771,9 @@
           </w:tcPr>
           <w:p>
             <w:r>
+              <w:rPr>
+                <w:rFonts w:ascii="Aptos" w:hAnsi="Aptos"/>
+              </w:rPr>
               <w:t>0.8958</w:t>
             </w:r>
           </w:p>
@@ -7408,6 +7786,9 @@
           </w:tcPr>
           <w:p>
             <w:r>
+              <w:rPr>
+                <w:rFonts w:ascii="Aptos" w:hAnsi="Aptos"/>
+              </w:rPr>
               <w:t>0.5434</w:t>
             </w:r>
           </w:p>
@@ -7420,6 +7801,9 @@
           </w:tcPr>
           <w:p>
             <w:r>
+              <w:rPr>
+                <w:rFonts w:ascii="Aptos" w:hAnsi="Aptos"/>
+              </w:rPr>
               <w:t>0.9199</w:t>
             </w:r>
           </w:p>
@@ -7432,6 +7816,9 @@
           </w:tcPr>
           <w:p>
             <w:r>
+              <w:rPr>
+                <w:rFonts w:ascii="Aptos" w:hAnsi="Aptos"/>
+              </w:rPr>
               <w:t>0.8451</w:t>
             </w:r>
           </w:p>
@@ -7449,6 +7836,9 @@
           </w:tcPr>
           <w:p>
             <w:r>
+              <w:rPr>
+                <w:rFonts w:ascii="Aptos" w:hAnsi="Aptos"/>
+              </w:rPr>
               <w:t>V5</w:t>
             </w:r>
           </w:p>
@@ -7461,6 +7851,9 @@
           </w:tcPr>
           <w:p>
             <w:r>
+              <w:rPr>
+                <w:rFonts w:ascii="Aptos" w:hAnsi="Aptos"/>
+              </w:rPr>
               <w:t>GPU Stacking (Optuna)</w:t>
             </w:r>
           </w:p>
@@ -7473,6 +7866,9 @@
           </w:tcPr>
           <w:p>
             <w:r>
+              <w:rPr>
+                <w:rFonts w:ascii="Aptos" w:hAnsi="Aptos"/>
+              </w:rPr>
               <w:t>0.8941</w:t>
             </w:r>
           </w:p>
@@ -7485,6 +7881,9 @@
           </w:tcPr>
           <w:p>
             <w:r>
+              <w:rPr>
+                <w:rFonts w:ascii="Aptos" w:hAnsi="Aptos"/>
+              </w:rPr>
               <w:t>0.5370</w:t>
             </w:r>
           </w:p>
@@ -7497,6 +7896,9 @@
           </w:tcPr>
           <w:p>
             <w:r>
+              <w:rPr>
+                <w:rFonts w:ascii="Aptos" w:hAnsi="Aptos"/>
+              </w:rPr>
               <w:t>0.9222</w:t>
             </w:r>
           </w:p>
@@ -7509,6 +7911,9 @@
           </w:tcPr>
           <w:p>
             <w:r>
+              <w:rPr>
+                <w:rFonts w:ascii="Aptos" w:hAnsi="Aptos"/>
+              </w:rPr>
               <w:t>0.8440</w:t>
             </w:r>
           </w:p>
@@ -7526,6 +7931,9 @@
           </w:tcPr>
           <w:p>
             <w:r>
+              <w:rPr>
+                <w:rFonts w:ascii="Aptos" w:hAnsi="Aptos"/>
+              </w:rPr>
               <w:t>V6</w:t>
             </w:r>
           </w:p>
@@ -7538,6 +7946,9 @@
           </w:tcPr>
           <w:p>
             <w:r>
+              <w:rPr>
+                <w:rFonts w:ascii="Aptos" w:hAnsi="Aptos"/>
+              </w:rPr>
               <w:t>Leak-Free + Grantham + SHAP CV</w:t>
             </w:r>
           </w:p>
@@ -7550,6 +7961,9 @@
           </w:tcPr>
           <w:p>
             <w:r>
+              <w:rPr>
+                <w:rFonts w:ascii="Aptos" w:hAnsi="Aptos"/>
+              </w:rPr>
               <w:t>0.8919</w:t>
             </w:r>
           </w:p>
@@ -7562,6 +7976,9 @@
           </w:tcPr>
           <w:p>
             <w:r>
+              <w:rPr>
+                <w:rFonts w:ascii="Aptos" w:hAnsi="Aptos"/>
+              </w:rPr>
               <w:t>0.5450</w:t>
             </w:r>
           </w:p>
@@ -7574,6 +7991,9 @@
           </w:tcPr>
           <w:p>
             <w:r>
+              <w:rPr>
+                <w:rFonts w:ascii="Aptos" w:hAnsi="Aptos"/>
+              </w:rPr>
               <w:t>0.9116</w:t>
             </w:r>
           </w:p>
@@ -7586,6 +8006,9 @@
           </w:tcPr>
           <w:p>
             <w:r>
+              <w:rPr>
+                <w:rFonts w:ascii="Aptos" w:hAnsi="Aptos"/>
+              </w:rPr>
               <w:t>0.8377</w:t>
             </w:r>
           </w:p>
@@ -7603,6 +8026,9 @@
           </w:tcPr>
           <w:p>
             <w:r>
+              <w:rPr>
+                <w:rFonts w:ascii="Aptos" w:hAnsi="Aptos"/>
+              </w:rPr>
               <w:t>V7</w:t>
             </w:r>
           </w:p>
@@ -7615,6 +8041,9 @@
           </w:tcPr>
           <w:p>
             <w:r>
+              <w:rPr>
+                <w:rFonts w:ascii="Aptos" w:hAnsi="Aptos"/>
+              </w:rPr>
               <w:t>Stacking + ADASYN + Optuna (700/500)</w:t>
             </w:r>
           </w:p>
@@ -7627,6 +8056,9 @@
           </w:tcPr>
           <w:p>
             <w:r>
+              <w:rPr>
+                <w:rFonts w:ascii="Aptos" w:hAnsi="Aptos"/>
+              </w:rPr>
               <w:t>0.8959</w:t>
             </w:r>
           </w:p>
@@ -7639,6 +8071,9 @@
           </w:tcPr>
           <w:p>
             <w:r>
+              <w:rPr>
+                <w:rFonts w:ascii="Aptos" w:hAnsi="Aptos"/>
+              </w:rPr>
               <w:t>0.5532</w:t>
             </w:r>
           </w:p>
@@ -7651,6 +8086,9 @@
           </w:tcPr>
           <w:p>
             <w:r>
+              <w:rPr>
+                <w:rFonts w:ascii="Aptos" w:hAnsi="Aptos"/>
+              </w:rPr>
               <w:t>0.9268</w:t>
             </w:r>
           </w:p>
@@ -7663,6 +8101,9 @@
           </w:tcPr>
           <w:p>
             <w:r>
+              <w:rPr>
+                <w:rFonts w:ascii="Aptos" w:hAnsi="Aptos"/>
+              </w:rPr>
               <w:t>0.8523</w:t>
             </w:r>
           </w:p>
@@ -7680,12 +8121,16 @@
     <w:p>
       <w:r>
         <w:rPr>
+          <w:rFonts w:ascii="Aptos" w:hAnsi="Aptos"/>
           <w:b/>
           <w:bCs/>
         </w:rPr>
         <w:t>Genel sonuç:</w:t>
       </w:r>
       <w:r>
+        <w:rPr>
+          <w:rFonts w:ascii="Aptos" w:hAnsi="Aptos"/>
+        </w:rPr>
         <w:t xml:space="preserve"> En yüksek performans V7 modelinde elde edilmiştir. MCC ve PR-AUC açısından anlamlı iyileşme gözlenmiştir.</w:t>
       </w:r>
     </w:p>
@@ -7699,6 +8144,7 @@
       </w:pPr>
       <w:r>
         <w:rPr>
+          <w:rFonts w:ascii="Aptos" w:hAnsi="Aptos"/>
           <w:b/>
           <w:bCs/>
         </w:rPr>
@@ -7706,6 +8152,7 @@
       </w:r>
       <w:r>
         <w:rPr>
+          <w:rFonts w:ascii="Aptos" w:hAnsi="Aptos"/>
           <w:b/>
           <w:bCs/>
         </w:rPr>
@@ -7753,6 +8200,7 @@
             </w:pPr>
             <w:r>
               <w:rPr>
+                <w:rFonts w:ascii="Aptos" w:hAnsi="Aptos"/>
                 <w:b/>
                 <w:bCs/>
               </w:rPr>
@@ -7775,6 +8223,7 @@
             </w:pPr>
             <w:r>
               <w:rPr>
+                <w:rFonts w:ascii="Aptos" w:hAnsi="Aptos"/>
                 <w:b/>
                 <w:bCs/>
               </w:rPr>
@@ -7797,6 +8246,7 @@
             </w:pPr>
             <w:r>
               <w:rPr>
+                <w:rFonts w:ascii="Aptos" w:hAnsi="Aptos"/>
                 <w:b/>
                 <w:bCs/>
               </w:rPr>
@@ -7818,6 +8268,9 @@
           </w:tcPr>
           <w:p>
             <w:r>
+              <w:rPr>
+                <w:rFonts w:ascii="Aptos" w:hAnsi="Aptos"/>
+              </w:rPr>
               <w:t>LightGBM</w:t>
             </w:r>
           </w:p>
@@ -7830,6 +8283,9 @@
           </w:tcPr>
           <w:p>
             <w:r>
+              <w:rPr>
+                <w:rFonts w:ascii="Aptos" w:hAnsi="Aptos"/>
+              </w:rPr>
               <w:t>GPU Histogram Boosting</w:t>
             </w:r>
           </w:p>
@@ -7842,6 +8298,9 @@
           </w:tcPr>
           <w:p>
             <w:r>
+              <w:rPr>
+                <w:rFonts w:ascii="Aptos" w:hAnsi="Aptos"/>
+              </w:rPr>
               <w:t>Sabit + önceki V5 parametreleri</w:t>
             </w:r>
           </w:p>
@@ -7860,6 +8319,9 @@
           </w:tcPr>
           <w:p>
             <w:r>
+              <w:rPr>
+                <w:rFonts w:ascii="Aptos" w:hAnsi="Aptos"/>
+              </w:rPr>
               <w:t>XGBoost</w:t>
             </w:r>
           </w:p>
@@ -7872,6 +8334,9 @@
           </w:tcPr>
           <w:p>
             <w:r>
+              <w:rPr>
+                <w:rFonts w:ascii="Aptos" w:hAnsi="Aptos"/>
+              </w:rPr>
               <w:t>CUDA / hist</w:t>
             </w:r>
           </w:p>
@@ -7884,6 +8349,9 @@
           </w:tcPr>
           <w:p>
             <w:r>
+              <w:rPr>
+                <w:rFonts w:ascii="Aptos" w:hAnsi="Aptos"/>
+              </w:rPr>
               <w:t>Optuna (700 trial)</w:t>
             </w:r>
           </w:p>
@@ -7902,6 +8370,9 @@
           </w:tcPr>
           <w:p>
             <w:r>
+              <w:rPr>
+                <w:rFonts w:ascii="Aptos" w:hAnsi="Aptos"/>
+              </w:rPr>
               <w:t>CatBoost</w:t>
             </w:r>
           </w:p>
@@ -7914,6 +8385,9 @@
           </w:tcPr>
           <w:p>
             <w:r>
+              <w:rPr>
+                <w:rFonts w:ascii="Aptos" w:hAnsi="Aptos"/>
+              </w:rPr>
               <w:t>GPU</w:t>
             </w:r>
           </w:p>
@@ -7926,6 +8400,9 @@
           </w:tcPr>
           <w:p>
             <w:r>
+              <w:rPr>
+                <w:rFonts w:ascii="Aptos" w:hAnsi="Aptos"/>
+              </w:rPr>
               <w:t>Optuna (500 trial)</w:t>
             </w:r>
           </w:p>
@@ -7944,6 +8421,9 @@
           </w:tcPr>
           <w:p>
             <w:r>
+              <w:rPr>
+                <w:rFonts w:ascii="Aptos" w:hAnsi="Aptos"/>
+              </w:rPr>
               <w:t>Ensemble</w:t>
             </w:r>
           </w:p>
@@ -7956,6 +8436,9 @@
           </w:tcPr>
           <w:p>
             <w:r>
+              <w:rPr>
+                <w:rFonts w:ascii="Aptos" w:hAnsi="Aptos"/>
+              </w:rPr>
               <w:t>StackingClassifier</w:t>
             </w:r>
           </w:p>
@@ -7968,6 +8451,9 @@
           </w:tcPr>
           <w:p>
             <w:r>
+              <w:rPr>
+                <w:rFonts w:ascii="Aptos" w:hAnsi="Aptos"/>
+              </w:rPr>
               <w:t>Logistic Regression meta-model</w:t>
             </w:r>
           </w:p>
@@ -7986,6 +8472,9 @@
           </w:tcPr>
           <w:p>
             <w:r>
+              <w:rPr>
+                <w:rFonts w:ascii="Aptos" w:hAnsi="Aptos"/>
+              </w:rPr>
               <w:t>Sınıf Dengesizliği</w:t>
             </w:r>
           </w:p>
@@ -7998,6 +8487,9 @@
           </w:tcPr>
           <w:p>
             <w:r>
+              <w:rPr>
+                <w:rFonts w:ascii="Aptos" w:hAnsi="Aptos"/>
+              </w:rPr>
               <w:t>ADASYN</w:t>
             </w:r>
           </w:p>
@@ -8010,6 +8502,9 @@
           </w:tcPr>
           <w:p>
             <w:r>
+              <w:rPr>
+                <w:rFonts w:ascii="Aptos" w:hAnsi="Aptos"/>
+              </w:rPr>
               <w:t>Fold bazlı (leak-free pipeline)</w:t>
             </w:r>
           </w:p>
@@ -8019,6 +8514,7 @@
     <w:p>
       <w:r>
         <w:rPr>
+          <w:rFonts w:ascii="Aptos" w:hAnsi="Aptos"/>
           <w:b/>
           <w:bCs/>
         </w:rPr>
@@ -8033,12 +8529,21 @@
         </w:numPr>
       </w:pPr>
       <w:r>
+        <w:rPr>
+          <w:rFonts w:ascii="Aptos" w:hAnsi="Aptos"/>
+        </w:rPr>
         <w:t>XGBoost en iyi MCC</w:t>
       </w:r>
       <w:r>
+        <w:rPr>
+          <w:rFonts w:ascii="Aptos" w:hAnsi="Aptos"/>
+        </w:rPr>
         <w:t>: 0.5685</w:t>
       </w:r>
       <w:r>
+        <w:rPr>
+          <w:rFonts w:ascii="Aptos" w:hAnsi="Aptos"/>
+        </w:rPr>
         <w:t xml:space="preserve"> </w:t>
       </w:r>
     </w:p>
@@ -8050,12 +8555,21 @@
         </w:numPr>
       </w:pPr>
       <w:r>
+        <w:rPr>
+          <w:rFonts w:ascii="Aptos" w:hAnsi="Aptos"/>
+        </w:rPr>
         <w:t>CatBoost en iyi MCC</w:t>
       </w:r>
       <w:r>
+        <w:rPr>
+          <w:rFonts w:ascii="Aptos" w:hAnsi="Aptos"/>
+        </w:rPr>
         <w:t>: 0.5741</w:t>
       </w:r>
       <w:r>
+        <w:rPr>
+          <w:rFonts w:ascii="Aptos" w:hAnsi="Aptos"/>
+        </w:rPr>
         <w:t xml:space="preserve"> </w:t>
       </w:r>
     </w:p>
@@ -8067,6 +8581,9 @@
         </w:numPr>
       </w:pPr>
       <w:r>
+        <w:rPr>
+          <w:rFonts w:ascii="Aptos" w:hAnsi="Aptos"/>
+        </w:rPr>
         <w:t xml:space="preserve">Arama uzayı: max_depth, reg_alpha, reg_lambda, scale_pos_weight </w:t>
       </w:r>
     </w:p>
@@ -8080,6 +8597,7 @@
       </w:pPr>
       <w:r>
         <w:rPr>
+          <w:rFonts w:ascii="Aptos" w:hAnsi="Aptos"/>
           <w:b/>
           <w:bCs/>
         </w:rPr>
@@ -8087,6 +8605,7 @@
       </w:r>
       <w:r>
         <w:rPr>
+          <w:rFonts w:ascii="Aptos" w:hAnsi="Aptos"/>
           <w:b/>
           <w:bCs/>
         </w:rPr>
@@ -8100,6 +8619,7 @@
       </w:pPr>
       <w:r>
         <w:rPr>
+          <w:rFonts w:ascii="Aptos" w:hAnsi="Aptos"/>
           <w:noProof/>
         </w:rPr>
         <w:drawing>
@@ -8145,6 +8665,7 @@
       </w:pPr>
       <w:r>
         <w:rPr>
+          <w:rFonts w:ascii="Aptos" w:hAnsi="Aptos"/>
           <w:b/>
           <w:sz w:val="20"/>
         </w:rPr>
@@ -8157,6 +8678,7 @@
       </w:pPr>
       <w:r>
         <w:rPr>
+          <w:rFonts w:ascii="Aptos" w:hAnsi="Aptos"/>
           <w:i/>
           <w:sz w:val="18"/>
         </w:rPr>
@@ -8171,6 +8693,7 @@
       </w:pPr>
       <w:r>
         <w:rPr>
+          <w:rFonts w:ascii="Aptos" w:hAnsi="Aptos"/>
           <w:noProof/>
         </w:rPr>
         <w:lastRenderedPageBreak/>
@@ -8217,6 +8740,7 @@
       </w:pPr>
       <w:r>
         <w:rPr>
+          <w:rFonts w:ascii="Aptos" w:hAnsi="Aptos"/>
           <w:b/>
           <w:sz w:val="20"/>
         </w:rPr>
@@ -8229,6 +8753,7 @@
       </w:pPr>
       <w:r>
         <w:rPr>
+          <w:rFonts w:ascii="Aptos" w:hAnsi="Aptos"/>
           <w:i/>
           <w:sz w:val="18"/>
         </w:rPr>
@@ -8280,6 +8805,7 @@
             </w:pPr>
             <w:r>
               <w:rPr>
+                <w:rFonts w:ascii="Aptos" w:hAnsi="Aptos"/>
                 <w:b/>
                 <w:bCs/>
               </w:rPr>
@@ -8302,6 +8828,7 @@
             </w:pPr>
             <w:r>
               <w:rPr>
+                <w:rFonts w:ascii="Aptos" w:hAnsi="Aptos"/>
                 <w:b/>
                 <w:bCs/>
               </w:rPr>
@@ -8324,6 +8851,7 @@
             </w:pPr>
             <w:r>
               <w:rPr>
+                <w:rFonts w:ascii="Aptos" w:hAnsi="Aptos"/>
                 <w:b/>
                 <w:bCs/>
               </w:rPr>
@@ -8346,6 +8874,7 @@
             </w:pPr>
             <w:r>
               <w:rPr>
+                <w:rFonts w:ascii="Aptos" w:hAnsi="Aptos"/>
                 <w:b/>
                 <w:bCs/>
               </w:rPr>
@@ -8368,6 +8897,7 @@
             </w:pPr>
             <w:r>
               <w:rPr>
+                <w:rFonts w:ascii="Aptos" w:hAnsi="Aptos"/>
                 <w:b/>
                 <w:bCs/>
               </w:rPr>
@@ -8390,6 +8920,7 @@
             </w:pPr>
             <w:r>
               <w:rPr>
+                <w:rFonts w:ascii="Aptos" w:hAnsi="Aptos"/>
                 <w:b/>
                 <w:bCs/>
               </w:rPr>
@@ -8411,6 +8942,9 @@
           </w:tcPr>
           <w:p>
             <w:r>
+              <w:rPr>
+                <w:rFonts w:ascii="Aptos" w:hAnsi="Aptos"/>
+              </w:rPr>
               <w:t>KANSER</w:t>
             </w:r>
           </w:p>
@@ -8423,6 +8957,9 @@
           </w:tcPr>
           <w:p>
             <w:r>
+              <w:rPr>
+                <w:rFonts w:ascii="Aptos" w:hAnsi="Aptos"/>
+              </w:rPr>
               <w:t>0.9116</w:t>
             </w:r>
           </w:p>
@@ -8435,6 +8972,9 @@
           </w:tcPr>
           <w:p>
             <w:r>
+              <w:rPr>
+                <w:rFonts w:ascii="Aptos" w:hAnsi="Aptos"/>
+              </w:rPr>
               <w:t>0.6889</w:t>
             </w:r>
           </w:p>
@@ -8447,6 +8987,9 @@
           </w:tcPr>
           <w:p>
             <w:r>
+              <w:rPr>
+                <w:rFonts w:ascii="Aptos" w:hAnsi="Aptos"/>
+              </w:rPr>
               <w:t>0.9557</w:t>
             </w:r>
           </w:p>
@@ -8459,6 +9002,9 @@
           </w:tcPr>
           <w:p>
             <w:r>
+              <w:rPr>
+                <w:rFonts w:ascii="Aptos" w:hAnsi="Aptos"/>
+              </w:rPr>
               <w:t>0.9203</w:t>
             </w:r>
           </w:p>
@@ -8471,6 +9017,9 @@
           </w:tcPr>
           <w:p>
             <w:r>
+              <w:rPr>
+                <w:rFonts w:ascii="Aptos" w:hAnsi="Aptos"/>
+              </w:rPr>
               <w:t>0.21</w:t>
             </w:r>
           </w:p>
@@ -8489,6 +9038,9 @@
           </w:tcPr>
           <w:p>
             <w:r>
+              <w:rPr>
+                <w:rFonts w:ascii="Aptos" w:hAnsi="Aptos"/>
+              </w:rPr>
               <w:t>PAH</w:t>
             </w:r>
           </w:p>
@@ -8501,6 +9053,9 @@
           </w:tcPr>
           <w:p>
             <w:r>
+              <w:rPr>
+                <w:rFonts w:ascii="Aptos" w:hAnsi="Aptos"/>
+              </w:rPr>
               <w:t>0.9383</w:t>
             </w:r>
           </w:p>
@@ -8513,6 +9068,9 @@
           </w:tcPr>
           <w:p>
             <w:r>
+              <w:rPr>
+                <w:rFonts w:ascii="Aptos" w:hAnsi="Aptos"/>
+              </w:rPr>
               <w:t>0.5590</w:t>
             </w:r>
           </w:p>
@@ -8525,6 +9083,9 @@
           </w:tcPr>
           <w:p>
             <w:r>
+              <w:rPr>
+                <w:rFonts w:ascii="Aptos" w:hAnsi="Aptos"/>
+              </w:rPr>
               <w:t>0.9345</w:t>
             </w:r>
           </w:p>
@@ -8537,6 +9098,9 @@
           </w:tcPr>
           <w:p>
             <w:r>
+              <w:rPr>
+                <w:rFonts w:ascii="Aptos" w:hAnsi="Aptos"/>
+              </w:rPr>
               <w:t>0.8091</w:t>
             </w:r>
           </w:p>
@@ -8549,6 +9113,9 @@
           </w:tcPr>
           <w:p>
             <w:r>
+              <w:rPr>
+                <w:rFonts w:ascii="Aptos" w:hAnsi="Aptos"/>
+              </w:rPr>
               <w:t>0.28</w:t>
             </w:r>
           </w:p>
@@ -8567,6 +9134,9 @@
           </w:tcPr>
           <w:p>
             <w:r>
+              <w:rPr>
+                <w:rFonts w:ascii="Aptos" w:hAnsi="Aptos"/>
+              </w:rPr>
               <w:t>CFTR</w:t>
             </w:r>
           </w:p>
@@ -8579,6 +9149,9 @@
           </w:tcPr>
           <w:p>
             <w:r>
+              <w:rPr>
+                <w:rFonts w:ascii="Aptos" w:hAnsi="Aptos"/>
+              </w:rPr>
               <w:t>0.9556</w:t>
             </w:r>
           </w:p>
@@ -8591,6 +9164,9 @@
           </w:tcPr>
           <w:p>
             <w:r>
+              <w:rPr>
+                <w:rFonts w:ascii="Aptos" w:hAnsi="Aptos"/>
+              </w:rPr>
               <w:t>0.7651</w:t>
             </w:r>
           </w:p>
@@ -8603,6 +9179,9 @@
           </w:tcPr>
           <w:p>
             <w:r>
+              <w:rPr>
+                <w:rFonts w:ascii="Aptos" w:hAnsi="Aptos"/>
+              </w:rPr>
               <w:t>0.9878</w:t>
             </w:r>
           </w:p>
@@ -8615,6 +9194,9 @@
           </w:tcPr>
           <w:p>
             <w:r>
+              <w:rPr>
+                <w:rFonts w:ascii="Aptos" w:hAnsi="Aptos"/>
+              </w:rPr>
               <w:t>0.9487</w:t>
             </w:r>
           </w:p>
@@ -8627,6 +9209,9 @@
           </w:tcPr>
           <w:p>
             <w:r>
+              <w:rPr>
+                <w:rFonts w:ascii="Aptos" w:hAnsi="Aptos"/>
+              </w:rPr>
               <w:t>0.21</w:t>
             </w:r>
           </w:p>
@@ -8636,12 +9221,16 @@
     <w:p>
       <w:r>
         <w:rPr>
+          <w:rFonts w:ascii="Aptos" w:hAnsi="Aptos"/>
           <w:b/>
           <w:bCs/>
         </w:rPr>
         <w:t>Gözlem:</w:t>
       </w:r>
       <w:r>
+        <w:rPr>
+          <w:rFonts w:ascii="Aptos" w:hAnsi="Aptos"/>
+        </w:rPr>
         <w:t xml:space="preserve"> En yüksek MCC CFTR grubunda, en düşük ayrıştırılabilirlik PAH grubunda gözlenmiştir.</w:t>
       </w:r>
     </w:p>
@@ -8655,6 +9244,7 @@
       </w:pPr>
       <w:r>
         <w:rPr>
+          <w:rFonts w:ascii="Aptos" w:hAnsi="Aptos"/>
           <w:b/>
           <w:bCs/>
         </w:rPr>
@@ -8662,6 +9252,7 @@
       </w:r>
       <w:r>
         <w:rPr>
+          <w:rFonts w:ascii="Aptos" w:hAnsi="Aptos"/>
           <w:b/>
           <w:bCs/>
         </w:rPr>
@@ -8712,6 +9303,7 @@
             </w:pPr>
             <w:r>
               <w:rPr>
+                <w:rFonts w:ascii="Aptos" w:hAnsi="Aptos"/>
                 <w:b/>
                 <w:bCs/>
               </w:rPr>
@@ -8734,6 +9326,7 @@
             </w:pPr>
             <w:r>
               <w:rPr>
+                <w:rFonts w:ascii="Aptos" w:hAnsi="Aptos"/>
                 <w:b/>
                 <w:bCs/>
               </w:rPr>
@@ -8756,6 +9349,7 @@
             </w:pPr>
             <w:r>
               <w:rPr>
+                <w:rFonts w:ascii="Aptos" w:hAnsi="Aptos"/>
                 <w:b/>
                 <w:bCs/>
               </w:rPr>
@@ -8778,6 +9372,7 @@
             </w:pPr>
             <w:r>
               <w:rPr>
+                <w:rFonts w:ascii="Aptos" w:hAnsi="Aptos"/>
                 <w:b/>
                 <w:bCs/>
               </w:rPr>
@@ -8800,6 +9395,7 @@
             </w:pPr>
             <w:r>
               <w:rPr>
+                <w:rFonts w:ascii="Aptos" w:hAnsi="Aptos"/>
                 <w:b/>
                 <w:bCs/>
               </w:rPr>
@@ -8821,6 +9417,9 @@
           </w:tcPr>
           <w:p>
             <w:r>
+              <w:rPr>
+                <w:rFonts w:ascii="Aptos" w:hAnsi="Aptos"/>
+              </w:rPr>
               <w:t>0.21</w:t>
             </w:r>
           </w:p>
@@ -8833,6 +9432,9 @@
           </w:tcPr>
           <w:p>
             <w:r>
+              <w:rPr>
+                <w:rFonts w:ascii="Aptos" w:hAnsi="Aptos"/>
+              </w:rPr>
               <w:t>0.8889</w:t>
             </w:r>
           </w:p>
@@ -8845,6 +9447,9 @@
           </w:tcPr>
           <w:p>
             <w:r>
+              <w:rPr>
+                <w:rFonts w:ascii="Aptos" w:hAnsi="Aptos"/>
+              </w:rPr>
               <w:t>0.8120</w:t>
             </w:r>
           </w:p>
@@ -8857,6 +9462,9 @@
           </w:tcPr>
           <w:p>
             <w:r>
+              <w:rPr>
+                <w:rFonts w:ascii="Aptos" w:hAnsi="Aptos"/>
+              </w:rPr>
               <w:t>0.9780</w:t>
             </w:r>
           </w:p>
@@ -8869,6 +9477,9 @@
           </w:tcPr>
           <w:p>
             <w:r>
+              <w:rPr>
+                <w:rFonts w:ascii="Aptos" w:hAnsi="Aptos"/>
+              </w:rPr>
               <w:t>0.5189</w:t>
             </w:r>
           </w:p>
@@ -8887,6 +9498,9 @@
           </w:tcPr>
           <w:p>
             <w:r>
+              <w:rPr>
+                <w:rFonts w:ascii="Aptos" w:hAnsi="Aptos"/>
+              </w:rPr>
               <w:t>0.25</w:t>
             </w:r>
           </w:p>
@@ -8899,6 +9513,9 @@
           </w:tcPr>
           <w:p>
             <w:r>
+              <w:rPr>
+                <w:rFonts w:ascii="Aptos" w:hAnsi="Aptos"/>
+              </w:rPr>
               <w:t>0.8934</w:t>
             </w:r>
           </w:p>
@@ -8911,6 +9528,9 @@
           </w:tcPr>
           <w:p>
             <w:r>
+              <w:rPr>
+                <w:rFonts w:ascii="Aptos" w:hAnsi="Aptos"/>
+              </w:rPr>
               <w:t>0.8245</w:t>
             </w:r>
           </w:p>
@@ -8923,6 +9543,9 @@
           </w:tcPr>
           <w:p>
             <w:r>
+              <w:rPr>
+                <w:rFonts w:ascii="Aptos" w:hAnsi="Aptos"/>
+              </w:rPr>
               <w:t>0.9652</w:t>
             </w:r>
           </w:p>
@@ -8935,6 +9558,9 @@
           </w:tcPr>
           <w:p>
             <w:r>
+              <w:rPr>
+                <w:rFonts w:ascii="Aptos" w:hAnsi="Aptos"/>
+              </w:rPr>
               <w:t>0.5410</w:t>
             </w:r>
           </w:p>
@@ -8959,6 +9585,7 @@
             </w:pPr>
             <w:r>
               <w:rPr>
+                <w:rFonts w:ascii="Aptos" w:hAnsi="Aptos"/>
                 <w:color w:val="000000" w:themeColor="text1"/>
               </w:rPr>
               <w:t>0.21 (optimum)</w:t>
@@ -8979,6 +9606,7 @@
             </w:pPr>
             <w:r>
               <w:rPr>
+                <w:rFonts w:ascii="Aptos" w:hAnsi="Aptos"/>
                 <w:color w:val="000000" w:themeColor="text1"/>
               </w:rPr>
               <w:t>0.8959</w:t>
@@ -8999,6 +9627,7 @@
             </w:pPr>
             <w:r>
               <w:rPr>
+                <w:rFonts w:ascii="Aptos" w:hAnsi="Aptos"/>
                 <w:color w:val="000000" w:themeColor="text1"/>
               </w:rPr>
               <w:t>0.8208</w:t>
@@ -9019,6 +9648,7 @@
             </w:pPr>
             <w:r>
               <w:rPr>
+                <w:rFonts w:ascii="Aptos" w:hAnsi="Aptos"/>
                 <w:color w:val="000000" w:themeColor="text1"/>
               </w:rPr>
               <w:t>0.9716</w:t>
@@ -9039,6 +9669,7 @@
             </w:pPr>
             <w:r>
               <w:rPr>
+                <w:rFonts w:ascii="Aptos" w:hAnsi="Aptos"/>
                 <w:color w:val="000000" w:themeColor="text1"/>
               </w:rPr>
               <w:t>0.5532</w:t>
@@ -9059,6 +9690,9 @@
           </w:tcPr>
           <w:p>
             <w:r>
+              <w:rPr>
+                <w:rFonts w:ascii="Aptos" w:hAnsi="Aptos"/>
+              </w:rPr>
               <w:t>0.28</w:t>
             </w:r>
           </w:p>
@@ -9071,6 +9705,9 @@
           </w:tcPr>
           <w:p>
             <w:r>
+              <w:rPr>
+                <w:rFonts w:ascii="Aptos" w:hAnsi="Aptos"/>
+              </w:rPr>
               <w:t>0.8910</w:t>
             </w:r>
           </w:p>
@@ -9083,6 +9720,9 @@
           </w:tcPr>
           <w:p>
             <w:r>
+              <w:rPr>
+                <w:rFonts w:ascii="Aptos" w:hAnsi="Aptos"/>
+              </w:rPr>
               <w:t>0.8360</w:t>
             </w:r>
           </w:p>
@@ -9095,6 +9735,9 @@
           </w:tcPr>
           <w:p>
             <w:r>
+              <w:rPr>
+                <w:rFonts w:ascii="Aptos" w:hAnsi="Aptos"/>
+              </w:rPr>
               <w:t>0.9520</w:t>
             </w:r>
           </w:p>
@@ -9107,6 +9750,9 @@
           </w:tcPr>
           <w:p>
             <w:r>
+              <w:rPr>
+                <w:rFonts w:ascii="Aptos" w:hAnsi="Aptos"/>
+              </w:rPr>
               <w:t>0.5478</w:t>
             </w:r>
           </w:p>
@@ -9116,12 +9762,16 @@
     <w:p>
       <w:r>
         <w:rPr>
+          <w:rFonts w:ascii="Aptos" w:hAnsi="Aptos"/>
           <w:b/>
           <w:bCs/>
         </w:rPr>
         <w:t>Seçilen optimum eşik:</w:t>
       </w:r>
       <w:r>
+        <w:rPr>
+          <w:rFonts w:ascii="Aptos" w:hAnsi="Aptos"/>
+        </w:rPr>
         <w:t xml:space="preserve"> 0.21 (MCC maksimizasyonu + yüksek recall dengesi)</w:t>
       </w:r>
     </w:p>
@@ -9134,6 +9784,7 @@
       </w:pPr>
       <w:r>
         <w:rPr>
+          <w:rFonts w:ascii="Aptos" w:hAnsi="Aptos"/>
           <w:b/>
           <w:bCs/>
         </w:rPr>
@@ -9141,6 +9792,7 @@
       </w:r>
       <w:r>
         <w:rPr>
+          <w:rFonts w:ascii="Aptos" w:hAnsi="Aptos"/>
           <w:b/>
           <w:bCs/>
         </w:rPr>
@@ -9154,6 +9806,7 @@
       </w:pPr>
       <w:r>
         <w:rPr>
+          <w:rFonts w:ascii="Aptos" w:hAnsi="Aptos"/>
           <w:noProof/>
         </w:rPr>
         <w:lastRenderedPageBreak/>
@@ -9200,6 +9853,7 @@
       </w:pPr>
       <w:r>
         <w:rPr>
+          <w:rFonts w:ascii="Aptos" w:hAnsi="Aptos"/>
           <w:b/>
           <w:sz w:val="20"/>
         </w:rPr>
@@ -9212,6 +9866,7 @@
       </w:pPr>
       <w:r>
         <w:rPr>
+          <w:rFonts w:ascii="Aptos" w:hAnsi="Aptos"/>
           <w:i/>
           <w:sz w:val="18"/>
         </w:rPr>
@@ -9226,6 +9881,7 @@
       </w:pPr>
       <w:r>
         <w:rPr>
+          <w:rFonts w:ascii="Aptos" w:hAnsi="Aptos"/>
           <w:noProof/>
         </w:rPr>
         <w:drawing>
@@ -9271,6 +9927,7 @@
       </w:pPr>
       <w:r>
         <w:rPr>
+          <w:rFonts w:ascii="Aptos" w:hAnsi="Aptos"/>
           <w:b/>
           <w:sz w:val="20"/>
         </w:rPr>
@@ -9283,6 +9940,7 @@
       </w:pPr>
       <w:r>
         <w:rPr>
+          <w:rFonts w:ascii="Aptos" w:hAnsi="Aptos"/>
           <w:i/>
           <w:sz w:val="18"/>
         </w:rPr>
@@ -9340,6 +9998,7 @@
             </w:pPr>
             <w:r>
               <w:rPr>
+                <w:rFonts w:ascii="Aptos" w:hAnsi="Aptos"/>
                 <w:b/>
                 <w:bCs/>
               </w:rPr>
@@ -9362,6 +10021,7 @@
             </w:pPr>
             <w:r>
               <w:rPr>
+                <w:rFonts w:ascii="Aptos" w:hAnsi="Aptos"/>
                 <w:b/>
                 <w:bCs/>
               </w:rPr>
@@ -9390,6 +10050,7 @@
             </w:pPr>
             <w:r>
               <w:rPr>
+                <w:rFonts w:ascii="Aptos" w:hAnsi="Aptos"/>
                 <w:b/>
                 <w:bCs/>
               </w:rPr>
@@ -9405,6 +10066,9 @@
           </w:tcPr>
           <w:p>
             <w:r>
+              <w:rPr>
+                <w:rFonts w:ascii="Aptos" w:hAnsi="Aptos"/>
+              </w:rPr>
               <w:t>407</w:t>
             </w:r>
           </w:p>
@@ -9417,6 +10081,9 @@
           </w:tcPr>
           <w:p>
             <w:r>
+              <w:rPr>
+                <w:rFonts w:ascii="Aptos" w:hAnsi="Aptos"/>
+              </w:rPr>
               <w:t>421</w:t>
             </w:r>
           </w:p>
@@ -9442,6 +10109,7 @@
             </w:pPr>
             <w:r>
               <w:rPr>
+                <w:rFonts w:ascii="Aptos" w:hAnsi="Aptos"/>
                 <w:b/>
                 <w:bCs/>
               </w:rPr>
@@ -9457,6 +10125,9 @@
           </w:tcPr>
           <w:p>
             <w:r>
+              <w:rPr>
+                <w:rFonts w:ascii="Aptos" w:hAnsi="Aptos"/>
+              </w:rPr>
               <w:t>64</w:t>
             </w:r>
           </w:p>
@@ -9469,6 +10140,9 @@
           </w:tcPr>
           <w:p>
             <w:r>
+              <w:rPr>
+                <w:rFonts w:ascii="Aptos" w:hAnsi="Aptos"/>
+              </w:rPr>
               <w:t>2048</w:t>
             </w:r>
           </w:p>
@@ -9484,6 +10158,7 @@
       </w:pPr>
       <w:r>
         <w:rPr>
+          <w:rFonts w:ascii="Aptos" w:hAnsi="Aptos"/>
           <w:b/>
           <w:bCs/>
         </w:rPr>
@@ -9491,6 +10166,7 @@
       </w:r>
       <w:r>
         <w:rPr>
+          <w:rFonts w:ascii="Aptos" w:hAnsi="Aptos"/>
           <w:b/>
           <w:bCs/>
         </w:rPr>
@@ -9506,6 +10182,7 @@
       </w:pPr>
       <w:r>
         <w:rPr>
+          <w:rFonts w:ascii="Aptos" w:hAnsi="Aptos"/>
           <w:b/>
           <w:bCs/>
         </w:rPr>
@@ -9513,6 +10190,7 @@
       </w:r>
       <w:r>
         <w:rPr>
+          <w:rFonts w:ascii="Aptos" w:hAnsi="Aptos"/>
           <w:b/>
           <w:bCs/>
         </w:rPr>
@@ -9522,12 +10200,16 @@
     <w:p>
       <w:r>
         <w:rPr>
+          <w:rFonts w:ascii="Aptos" w:hAnsi="Aptos"/>
           <w:b/>
           <w:bCs/>
         </w:rPr>
         <w:t>Klinik yorum açısından:</w:t>
       </w:r>
       <w:r>
+        <w:rPr>
+          <w:rFonts w:ascii="Aptos" w:hAnsi="Aptos"/>
+        </w:rPr>
         <w:t xml:space="preserve"> FN değerinin düşük olması, patojenik varyantların kaçırılma riskinin azaltıldığını göstermektedir.</w:t>
       </w:r>
     </w:p>
@@ -9540,16 +10222,23 @@
         </w:numPr>
       </w:pPr>
       <w:r>
+        <w:rPr>
+          <w:rFonts w:ascii="Aptos" w:hAnsi="Aptos"/>
+        </w:rPr>
         <w:t xml:space="preserve">En yüksek genel performans: </w:t>
       </w:r>
       <w:r>
         <w:rPr>
+          <w:rFonts w:ascii="Aptos" w:hAnsi="Aptos"/>
           <w:b/>
           <w:bCs/>
         </w:rPr>
         <w:t>V7 (F1=0.8959, MCC=0.5532)</w:t>
       </w:r>
       <w:r>
+        <w:rPr>
+          <w:rFonts w:ascii="Aptos" w:hAnsi="Aptos"/>
+        </w:rPr>
         <w:t xml:space="preserve"> </w:t>
       </w:r>
     </w:p>
@@ -9561,16 +10250,23 @@
         </w:numPr>
       </w:pPr>
       <w:r>
+        <w:rPr>
+          <w:rFonts w:ascii="Aptos" w:hAnsi="Aptos"/>
+        </w:rPr>
         <w:t xml:space="preserve">En kritik kazanım: </w:t>
       </w:r>
       <w:r>
         <w:rPr>
+          <w:rFonts w:ascii="Aptos" w:hAnsi="Aptos"/>
           <w:b/>
           <w:bCs/>
         </w:rPr>
         <w:t>False Negative azaltımı (V5: 81 → V7: 101 dengeli recall ile)</w:t>
       </w:r>
       <w:r>
+        <w:rPr>
+          <w:rFonts w:ascii="Aptos" w:hAnsi="Aptos"/>
+        </w:rPr>
         <w:t xml:space="preserve"> </w:t>
       </w:r>
     </w:p>
@@ -9582,16 +10278,23 @@
         </w:numPr>
       </w:pPr>
       <w:r>
+        <w:rPr>
+          <w:rFonts w:ascii="Aptos" w:hAnsi="Aptos"/>
+        </w:rPr>
         <w:t xml:space="preserve">En güçlü alt grup: </w:t>
       </w:r>
       <w:r>
         <w:rPr>
+          <w:rFonts w:ascii="Aptos" w:hAnsi="Aptos"/>
           <w:b/>
           <w:bCs/>
         </w:rPr>
         <w:t>CFTR (MCC=0.7651)</w:t>
       </w:r>
       <w:r>
+        <w:rPr>
+          <w:rFonts w:ascii="Aptos" w:hAnsi="Aptos"/>
+        </w:rPr>
         <w:t xml:space="preserve"> </w:t>
       </w:r>
     </w:p>
@@ -9603,16 +10306,23 @@
         </w:numPr>
       </w:pPr>
       <w:r>
+        <w:rPr>
+          <w:rFonts w:ascii="Aptos" w:hAnsi="Aptos"/>
+        </w:rPr>
         <w:t xml:space="preserve">En zor alt grup: </w:t>
       </w:r>
       <w:r>
         <w:rPr>
+          <w:rFonts w:ascii="Aptos" w:hAnsi="Aptos"/>
           <w:b/>
           <w:bCs/>
         </w:rPr>
         <w:t>PAH (heterojen sınıf yapısı nedeniyle düşük MCC)</w:t>
       </w:r>
       <w:r>
+        <w:rPr>
+          <w:rFonts w:ascii="Aptos" w:hAnsi="Aptos"/>
+        </w:rPr>
         <w:t xml:space="preserve"> </w:t>
       </w:r>
     </w:p>
@@ -9624,6 +10334,9 @@
         </w:numPr>
       </w:pPr>
       <w:r>
+        <w:rPr>
+          <w:rFonts w:ascii="Aptos" w:hAnsi="Aptos"/>
+        </w:rPr>
         <w:t>Optuna + ADASYN kombinasyonu, V7 performans artışında belirleyici olmuştur.</w:t>
       </w:r>
     </w:p>
@@ -9641,6 +10354,7 @@
       <w:bookmarkStart w:id="8" w:name="_Toc232979046"/>
       <w:r>
         <w:rPr>
+          <w:rFonts w:ascii="Aptos" w:hAnsi="Aptos"/>
           <w:b/>
           <w:bCs/>
           <w:color w:val="000000" w:themeColor="text1"/>
@@ -9652,6 +10366,7 @@
       <w:bookmarkEnd w:id="8"/>
       <w:r>
         <w:rPr>
+          <w:rFonts w:ascii="Aptos" w:hAnsi="Aptos"/>
           <w:b/>
           <w:bCs/>
           <w:color w:val="000000" w:themeColor="text1"/>
@@ -9666,6 +10381,9 @@
         <w:jc w:val="both"/>
       </w:pPr>
       <w:r>
+        <w:rPr>
+          <w:rFonts w:ascii="Aptos" w:hAnsi="Aptos"/>
+        </w:rPr>
         <w:t>Bu bölümde V1–V7 modellerinin sonuçları klinik ve biyoinformatik açıdan özetlenmiş, güçlü ve zayıf yönler ile çalışmanın genel katkısı değerlendirilmiştir.</w:t>
       </w:r>
     </w:p>
@@ -9688,6 +10406,7 @@
       <w:bookmarkStart w:id="9" w:name="_Toc232979047"/>
       <w:r>
         <w:rPr>
+          <w:rFonts w:ascii="Aptos" w:hAnsi="Aptos"/>
           <w:b/>
           <w:bCs/>
           <w:color w:val="000000" w:themeColor="text1"/>
@@ -9703,12 +10422,21 @@
         <w:jc w:val="both"/>
       </w:pPr>
       <w:r>
+        <w:rPr>
+          <w:rFonts w:ascii="Aptos" w:hAnsi="Aptos"/>
+        </w:rPr>
         <w:t xml:space="preserve">En yüksek </w:t>
       </w:r>
       <w:r>
+        <w:rPr>
+          <w:rFonts w:ascii="Aptos" w:hAnsi="Aptos"/>
+        </w:rPr>
         <w:t>performans V7 modeli (F1: 0.8959, MCC: 0.5532)</w:t>
       </w:r>
       <w:r>
+        <w:rPr>
+          <w:rFonts w:ascii="Aptos" w:hAnsi="Aptos"/>
+        </w:rPr>
         <w:t xml:space="preserve"> ile elde edilmiştir. Performans artışı yalnızca model karmaşıklığından değil, veri temsilinin iyileştirilmesinden kaynaklanmaktadır.</w:t>
       </w:r>
     </w:p>
@@ -9722,12 +10450,16 @@
       </w:pPr>
       <w:r>
         <w:rPr>
+          <w:rFonts w:ascii="Aptos" w:hAnsi="Aptos"/>
           <w:b/>
           <w:bCs/>
         </w:rPr>
         <w:t>V1–V2:</w:t>
       </w:r>
       <w:r>
+        <w:rPr>
+          <w:rFonts w:ascii="Aptos" w:hAnsi="Aptos"/>
+        </w:rPr>
         <w:t xml:space="preserve"> Güçlü bir baseline oluşturulmuş, ancak eksik veri ve biyolojik yorum eksikliği nedeniyle sınırlı kalmıştır. </w:t>
       </w:r>
     </w:p>
@@ -9741,12 +10473,16 @@
       </w:pPr>
       <w:r>
         <w:rPr>
+          <w:rFonts w:ascii="Aptos" w:hAnsi="Aptos"/>
           <w:b/>
           <w:bCs/>
         </w:rPr>
         <w:t>V3:</w:t>
       </w:r>
       <w:r>
+        <w:rPr>
+          <w:rFonts w:ascii="Aptos" w:hAnsi="Aptos"/>
+        </w:rPr>
         <w:t xml:space="preserve"> Amino asitlerin biyokimyasal özelliklere dönüştürülmesi performansı artırmıştır. </w:t>
       </w:r>
     </w:p>
@@ -9760,12 +10496,16 @@
       </w:pPr>
       <w:r>
         <w:rPr>
+          <w:rFonts w:ascii="Aptos" w:hAnsi="Aptos"/>
           <w:b/>
           <w:bCs/>
         </w:rPr>
         <w:t>V4–V5:</w:t>
       </w:r>
       <w:r>
+        <w:rPr>
+          <w:rFonts w:ascii="Aptos" w:hAnsi="Aptos"/>
+        </w:rPr>
         <w:t xml:space="preserve"> Stacking mimarisi ve GPU kullanımı ile model kapasitesi artmıştır. </w:t>
       </w:r>
     </w:p>
@@ -9779,12 +10519,16 @@
       </w:pPr>
       <w:r>
         <w:rPr>
+          <w:rFonts w:ascii="Aptos" w:hAnsi="Aptos"/>
           <w:b/>
           <w:bCs/>
         </w:rPr>
         <w:t>V6:</w:t>
       </w:r>
       <w:r>
+        <w:rPr>
+          <w:rFonts w:ascii="Aptos" w:hAnsi="Aptos"/>
+        </w:rPr>
         <w:t xml:space="preserve"> Veri sızıntısının giderilmesi ile daha gerçekçi ancak daha düşük skorlar elde edilmiştir. </w:t>
       </w:r>
     </w:p>
@@ -9798,12 +10542,16 @@
       </w:pPr>
       <w:r>
         <w:rPr>
+          <w:rFonts w:ascii="Aptos" w:hAnsi="Aptos"/>
           <w:b/>
           <w:bCs/>
         </w:rPr>
         <w:t>V7:</w:t>
       </w:r>
       <w:r>
+        <w:rPr>
+          <w:rFonts w:ascii="Aptos" w:hAnsi="Aptos"/>
+        </w:rPr>
         <w:t xml:space="preserve"> ADASYN ve Optuna ile en dengeli performans elde edilmiştir. </w:t>
       </w:r>
     </w:p>
@@ -9826,6 +10574,7 @@
       <w:bookmarkStart w:id="10" w:name="_Toc232979048"/>
       <w:r>
         <w:rPr>
+          <w:rFonts w:ascii="Aptos" w:hAnsi="Aptos"/>
           <w:b/>
           <w:bCs/>
           <w:color w:val="000000" w:themeColor="text1"/>
@@ -9841,6 +10590,9 @@
         <w:jc w:val="both"/>
       </w:pPr>
       <w:r>
+        <w:rPr>
+          <w:rFonts w:ascii="Aptos" w:hAnsi="Aptos"/>
+        </w:rPr>
         <w:t>Model performansı özellikle veri alt gruplarına göre değişkenlik göstermektedir:</w:t>
       </w:r>
     </w:p>
@@ -9854,12 +10606,16 @@
       </w:pPr>
       <w:r>
         <w:rPr>
+          <w:rFonts w:ascii="Aptos" w:hAnsi="Aptos"/>
           <w:b/>
           <w:bCs/>
         </w:rPr>
         <w:t>Başarılı gruplar:</w:t>
       </w:r>
       <w:r>
+        <w:rPr>
+          <w:rFonts w:ascii="Aptos" w:hAnsi="Aptos"/>
+        </w:rPr>
         <w:t xml:space="preserve"> CFTR ve KANSER gruplarında yüksek ayrıştırma başarısı elde edilmiştir. </w:t>
       </w:r>
     </w:p>
@@ -9873,12 +10629,16 @@
       </w:pPr>
       <w:r>
         <w:rPr>
+          <w:rFonts w:ascii="Aptos" w:hAnsi="Aptos"/>
           <w:b/>
           <w:bCs/>
         </w:rPr>
         <w:t>Zorlayıcı grup:</w:t>
       </w:r>
       <w:r>
+        <w:rPr>
+          <w:rFonts w:ascii="Aptos" w:hAnsi="Aptos"/>
+        </w:rPr>
         <w:t xml:space="preserve"> PAH, yüksek sınıf dengesizliği nedeniyle en düşük MCC değerine sahip gruptur. </w:t>
       </w:r>
     </w:p>
@@ -9887,6 +10647,9 @@
         <w:jc w:val="both"/>
       </w:pPr>
       <w:r>
+        <w:rPr>
+          <w:rFonts w:ascii="Aptos" w:hAnsi="Aptos"/>
+        </w:rPr>
         <w:t>Hata analizinde:</w:t>
       </w:r>
     </w:p>
@@ -9900,12 +10663,16 @@
       </w:pPr>
       <w:r>
         <w:rPr>
+          <w:rFonts w:ascii="Aptos" w:hAnsi="Aptos"/>
           <w:b/>
           <w:bCs/>
         </w:rPr>
         <w:t>False Negative (FN):</w:t>
       </w:r>
       <w:r>
+        <w:rPr>
+          <w:rFonts w:ascii="Aptos" w:hAnsi="Aptos"/>
+        </w:rPr>
         <w:t xml:space="preserve"> Klinik açıdan en kritik hata türüdür. V7’de 101 seviyesine düşürülmüştür. </w:t>
       </w:r>
     </w:p>
@@ -9919,12 +10686,16 @@
       </w:pPr>
       <w:r>
         <w:rPr>
+          <w:rFonts w:ascii="Aptos" w:hAnsi="Aptos"/>
           <w:b/>
           <w:bCs/>
         </w:rPr>
         <w:t>False Positive (FP):</w:t>
       </w:r>
       <w:r>
+        <w:rPr>
+          <w:rFonts w:ascii="Aptos" w:hAnsi="Aptos"/>
+        </w:rPr>
         <w:t xml:space="preserve"> Daha yüksek recall hedeflendiği için görece artmıştır. </w:t>
       </w:r>
     </w:p>
@@ -9938,6 +10709,9 @@
         <w:jc w:val="both"/>
       </w:pPr>
       <w:r>
+        <w:rPr>
+          <w:rFonts w:ascii="Aptos" w:hAnsi="Aptos"/>
+        </w:rPr>
         <w:t>Özellik düzeyinde:</w:t>
       </w:r>
     </w:p>
@@ -9950,6 +10724,9 @@
         <w:jc w:val="both"/>
       </w:pPr>
       <w:r>
+        <w:rPr>
+          <w:rFonts w:ascii="Aptos" w:hAnsi="Aptos"/>
+        </w:rPr>
         <w:t xml:space="preserve">AA tabanlı biyokimyasal değişkenler klinik olarak en anlamlı katkıyı sağlamıştır. </w:t>
       </w:r>
     </w:p>
@@ -9962,6 +10739,9 @@
         <w:jc w:val="both"/>
       </w:pPr>
       <w:r>
+        <w:rPr>
+          <w:rFonts w:ascii="Aptos" w:hAnsi="Aptos"/>
+        </w:rPr>
         <w:t xml:space="preserve">EK_ değişkenleri en yüksek model etkisine sahip olmasına rağmen biyolojik yorumu zordur. </w:t>
       </w:r>
     </w:p>
@@ -9974,6 +10754,9 @@
         <w:jc w:val="both"/>
       </w:pPr>
       <w:r>
+        <w:rPr>
+          <w:rFonts w:ascii="Aptos" w:hAnsi="Aptos"/>
+        </w:rPr>
         <w:t xml:space="preserve">Missing indicator yapıları eksiklik bilgisinin model tarafından öğrenilebildiğini göstermiştir. </w:t>
       </w:r>
     </w:p>
@@ -9997,6 +10780,7 @@
       <w:bookmarkStart w:id="11" w:name="_Toc232979049"/>
       <w:r>
         <w:rPr>
+          <w:rFonts w:ascii="Aptos" w:hAnsi="Aptos"/>
           <w:b/>
           <w:bCs/>
           <w:color w:val="000000" w:themeColor="text1"/>
@@ -10013,6 +10797,9 @@
         <w:jc w:val="both"/>
       </w:pPr>
       <w:r>
+        <w:rPr>
+          <w:rFonts w:ascii="Aptos" w:hAnsi="Aptos"/>
+        </w:rPr>
         <w:t>Çalışma, ClinVar ve gnomAD tabanlı missense varyant sınıflandırma yaklaşımlarıyla uyumludur. Ancak literatürdeki birçok çalışmadan farklı olarak:</w:t>
       </w:r>
     </w:p>
@@ -10025,6 +10812,9 @@
         <w:jc w:val="both"/>
       </w:pPr>
       <w:r>
+        <w:rPr>
+          <w:rFonts w:ascii="Aptos" w:hAnsi="Aptos"/>
+        </w:rPr>
         <w:t xml:space="preserve">biyokimyasal feature engineering, </w:t>
       </w:r>
     </w:p>
@@ -10037,6 +10827,9 @@
         <w:jc w:val="both"/>
       </w:pPr>
       <w:r>
+        <w:rPr>
+          <w:rFonts w:ascii="Aptos" w:hAnsi="Aptos"/>
+        </w:rPr>
         <w:t xml:space="preserve">missingness modelleme, </w:t>
       </w:r>
     </w:p>
@@ -10049,6 +10842,9 @@
         <w:jc w:val="both"/>
       </w:pPr>
       <w:r>
+        <w:rPr>
+          <w:rFonts w:ascii="Aptos" w:hAnsi="Aptos"/>
+        </w:rPr>
         <w:t xml:space="preserve">stacking + Optuna + GPU optimizasyonu </w:t>
       </w:r>
     </w:p>
@@ -10057,6 +10853,9 @@
         <w:jc w:val="both"/>
       </w:pPr>
       <w:r>
+        <w:rPr>
+          <w:rFonts w:ascii="Aptos" w:hAnsi="Aptos"/>
+        </w:rPr>
         <w:t>tek bir uçtan uca pipeline içinde birleştirilmiştir.</w:t>
       </w:r>
     </w:p>
@@ -10065,6 +10864,9 @@
         <w:jc w:val="both"/>
       </w:pPr>
       <w:r>
+        <w:rPr>
+          <w:rFonts w:ascii="Aptos" w:hAnsi="Aptos"/>
+        </w:rPr>
         <w:t>Bu yönüyle çalışma, yalnızca bir sınıflandırma modeli değil, aynı zamanda biyolojik veriyi yapay zekaya entegre eden bütüncül bir sistem sunmaktadır.</w:t>
       </w:r>
     </w:p>
@@ -10074,6 +10876,7 @@
       </w:pPr>
       <w:r>
         <w:rPr>
+          <w:rFonts w:ascii="Aptos" w:hAnsi="Aptos"/>
           <w:b/>
           <w:bCs/>
           <w:color w:val="000000" w:themeColor="text1"/>
@@ -10086,6 +10889,9 @@
         <w:jc w:val="both"/>
       </w:pPr>
       <w:r>
+        <w:rPr>
+          <w:rFonts w:ascii="Aptos" w:hAnsi="Aptos"/>
+        </w:rPr>
         <w:t>Final aşamada modelin karşılaşabileceği temel zorluklar:</w:t>
       </w:r>
     </w:p>
@@ -10098,6 +10904,9 @@
         <w:jc w:val="both"/>
       </w:pPr>
       <w:r>
+        <w:rPr>
+          <w:rFonts w:ascii="Aptos" w:hAnsi="Aptos"/>
+        </w:rPr>
         <w:t xml:space="preserve">Veri dağılım kayması (distribution shift) </w:t>
       </w:r>
     </w:p>
@@ -10110,6 +10919,9 @@
         <w:jc w:val="both"/>
       </w:pPr>
       <w:r>
+        <w:rPr>
+          <w:rFonts w:ascii="Aptos" w:hAnsi="Aptos"/>
+        </w:rPr>
         <w:t xml:space="preserve">Yeni varyant tiplerinin ortaya çıkması </w:t>
       </w:r>
     </w:p>
@@ -10122,6 +10934,9 @@
         <w:jc w:val="both"/>
       </w:pPr>
       <w:r>
+        <w:rPr>
+          <w:rFonts w:ascii="Aptos" w:hAnsi="Aptos"/>
+        </w:rPr>
         <w:t xml:space="preserve">Aşırı sınıf dengesizliğinin artması </w:t>
       </w:r>
     </w:p>
@@ -10134,12 +10949,21 @@
         <w:jc w:val="both"/>
       </w:pPr>
       <w:r>
+        <w:rPr>
+          <w:rFonts w:ascii="Aptos" w:hAnsi="Aptos"/>
+        </w:rPr>
         <w:t xml:space="preserve">Leaderboard optimizasyonuna bağlı </w:t>
       </w:r>
       <w:r>
+        <w:rPr>
+          <w:rFonts w:ascii="Aptos" w:hAnsi="Aptos"/>
+        </w:rPr>
         <w:t>ş</w:t>
       </w:r>
       <w:r>
+        <w:rPr>
+          <w:rFonts w:ascii="Aptos" w:hAnsi="Aptos"/>
+        </w:rPr>
         <w:t xml:space="preserve">overfitting riski </w:t>
       </w:r>
     </w:p>
@@ -10162,6 +10986,7 @@
       <w:bookmarkStart w:id="12" w:name="_Toc232979050"/>
       <w:r>
         <w:rPr>
+          <w:rFonts w:ascii="Aptos" w:hAnsi="Aptos"/>
           <w:b/>
           <w:bCs/>
           <w:color w:val="000000" w:themeColor="text1"/>
@@ -10177,6 +11002,9 @@
         <w:jc w:val="both"/>
       </w:pPr>
       <w:r>
+        <w:rPr>
+          <w:rFonts w:ascii="Aptos" w:hAnsi="Aptos"/>
+        </w:rPr>
         <w:t>Geliştirilen sistem, missense varyant patojenite tahmininde:</w:t>
       </w:r>
     </w:p>
@@ -10189,6 +11017,9 @@
         <w:jc w:val="both"/>
       </w:pPr>
       <w:r>
+        <w:rPr>
+          <w:rFonts w:ascii="Aptos" w:hAnsi="Aptos"/>
+        </w:rPr>
         <w:t xml:space="preserve">klinik olarak kritik olan FN hatasını azaltmayı, </w:t>
       </w:r>
     </w:p>
@@ -10201,6 +11032,9 @@
         <w:jc w:val="both"/>
       </w:pPr>
       <w:r>
+        <w:rPr>
+          <w:rFonts w:ascii="Aptos" w:hAnsi="Aptos"/>
+        </w:rPr>
         <w:t xml:space="preserve">biyolojik bilgi ile makine öğrenmesini birleştirmeyi, </w:t>
       </w:r>
     </w:p>
@@ -10213,6 +11047,9 @@
         <w:jc w:val="both"/>
       </w:pPr>
       <w:r>
+        <w:rPr>
+          <w:rFonts w:ascii="Aptos" w:hAnsi="Aptos"/>
+        </w:rPr>
         <w:t xml:space="preserve">yüksek performanslı ve genellenebilir bir pipeline oluşturmayı </w:t>
       </w:r>
     </w:p>
@@ -10221,6 +11058,9 @@
         <w:jc w:val="both"/>
       </w:pPr>
       <w:r>
+        <w:rPr>
+          <w:rFonts w:ascii="Aptos" w:hAnsi="Aptos"/>
+        </w:rPr>
         <w:t>başarmıştır.</w:t>
       </w:r>
     </w:p>
@@ -10239,6 +11079,7 @@
       <w:bookmarkStart w:id="13" w:name="_Toc232979051"/>
       <w:r>
         <w:rPr>
+          <w:rFonts w:ascii="Aptos" w:hAnsi="Aptos"/>
           <w:b/>
           <w:bCs/>
           <w:color w:val="000000" w:themeColor="text1"/>
@@ -10249,6 +11090,7 @@
       </w:r>
       <w:r>
         <w:rPr>
+          <w:rFonts w:ascii="Aptos" w:hAnsi="Aptos"/>
           <w:b/>
           <w:bCs/>
           <w:color w:val="000000" w:themeColor="text1"/>
@@ -10259,6 +11101,7 @@
       </w:r>
       <w:r>
         <w:rPr>
+          <w:rFonts w:ascii="Aptos" w:hAnsi="Aptos"/>
           <w:b/>
           <w:bCs/>
           <w:color w:val="000000" w:themeColor="text1"/>
@@ -10270,6 +11113,7 @@
       <w:bookmarkEnd w:id="13"/>
       <w:r>
         <w:rPr>
+          <w:rFonts w:ascii="Aptos" w:hAnsi="Aptos"/>
           <w:b/>
           <w:bCs/>
           <w:color w:val="000000" w:themeColor="text1"/>
@@ -10285,6 +11129,9 @@
         <w:jc w:val="both"/>
       </w:pPr>
       <w:r>
+        <w:rPr>
+          <w:rFonts w:ascii="Aptos" w:hAnsi="Aptos"/>
+        </w:rPr>
         <w:t>[1] S. Richards et al., "Standards and guidelines for the interpretation of sequence variants: a joint consensus recommendation of the American College of Medical Genetics and Genomics and the Association for Molecular Pathology," Genetics in Medicine, vol. 17, no. 5, pp. 405–423, 2015.</w:t>
       </w:r>
     </w:p>
@@ -10294,6 +11141,9 @@
         <w:jc w:val="both"/>
       </w:pPr>
       <w:r>
+        <w:rPr>
+          <w:rFonts w:ascii="Aptos" w:hAnsi="Aptos"/>
+        </w:rPr>
         <w:t>[2] D. G. MacArthur et al., "Guidelines for investigating causality of sequence variants in human disease," Nature, vol. 508, no. 7497, pp. 469–476, 2014.</w:t>
       </w:r>
     </w:p>
@@ -10303,6 +11153,9 @@
         <w:jc w:val="both"/>
       </w:pPr>
       <w:r>
+        <w:rPr>
+          <w:rFonts w:ascii="Aptos" w:hAnsi="Aptos"/>
+        </w:rPr>
         <w:t>[3] J. Zhou et al., "Deep learning-based predictive modeling of clinical outcomes using high-dimensional genomic data," Briefings in Bioinformatics, vol. 22, no. 4, pp. bbaa255, 2021.</w:t>
       </w:r>
     </w:p>
@@ -10312,6 +11165,9 @@
         <w:jc w:val="both"/>
       </w:pPr>
       <w:r>
+        <w:rPr>
+          <w:rFonts w:ascii="Aptos" w:hAnsi="Aptos"/>
+        </w:rPr>
         <w:t>[4] T. Saito and M. Rehmsmeier, "The precision-recall plot is more informative than the ROC plot when evaluating binary classifiers on imbalanced datasets," PLOS ONE, vol. 10, no. 3, p. e0118432, 2015.</w:t>
       </w:r>
     </w:p>
@@ -10321,6 +11177,9 @@
         <w:jc w:val="both"/>
       </w:pPr>
       <w:r>
+        <w:rPr>
+          <w:rFonts w:ascii="Aptos" w:hAnsi="Aptos"/>
+        </w:rPr>
         <w:t>[5] N. V. Chawla, "Data mining for imbalanced datasets: An overview," Data Mining and Knowledge Discovery Handbook, Springer, pp. 875–886, 2009.</w:t>
       </w:r>
     </w:p>
@@ -10330,6 +11189,9 @@
         <w:jc w:val="both"/>
       </w:pPr>
       <w:r>
+        <w:rPr>
+          <w:rFonts w:ascii="Aptos" w:hAnsi="Aptos"/>
+        </w:rPr>
         <w:t>[6] A. Karczewski et al., "The mutational constraint spectrum quantified from variation in 141,456 humans," Nature, vol. 581, no. 7809, pp. 434–443, 2020.</w:t>
       </w:r>
     </w:p>
@@ -10339,6 +11201,9 @@
         <w:jc w:val="both"/>
       </w:pPr>
       <w:r>
+        <w:rPr>
+          <w:rFonts w:ascii="Aptos" w:hAnsi="Aptos"/>
+        </w:rPr>
         <w:t>[8] N. V. Chawla, K. W. Bowyer, L. O. Hall, and W. P. Kegelmeyer, "SMOTE: Synthetic Minority Over-sampling Technique," Journal of Artificial Intelligence Research, vol. 16, pp. 321–357, 2002.</w:t>
       </w:r>
     </w:p>
@@ -10348,6 +11213,9 @@
         <w:jc w:val="both"/>
       </w:pPr>
       <w:r>
+        <w:rPr>
+          <w:rFonts w:ascii="Aptos" w:hAnsi="Aptos"/>
+        </w:rPr>
         <w:lastRenderedPageBreak/>
         <w:t>[9] T. Saito and M. Rehmsmeier, "The precision-recall plot is more informative than the ROC plot when evaluating binary classifiers on imbalanced datasets," PLOS ONE, vol. 10, no. 3, p. e0118432, 2015.</w:t>
       </w:r>
@@ -10358,6 +11226,9 @@
         <w:jc w:val="both"/>
       </w:pPr>
       <w:r>
+        <w:rPr>
+          <w:rFonts w:ascii="Aptos" w:hAnsi="Aptos"/>
+        </w:rPr>
         <w:t>[10] S. Richards et al., "Standards and guidelines for the interpretation of sequence variants: a joint consensus recommendation of the American College of Medical Genetics and Genomics and the Association for Molecular Pathology," Genetics in Medicine, vol. 17, no. 5, pp. 405–423, 2015.</w:t>
       </w:r>
     </w:p>
@@ -10367,6 +11238,9 @@
         <w:jc w:val="both"/>
       </w:pPr>
       <w:r>
+        <w:rPr>
+          <w:rFonts w:ascii="Aptos" w:hAnsi="Aptos"/>
+        </w:rPr>
         <w:t>[11] D. Chicco and G. Jurman, "The advantages of the Matthews correlation coefficient (MCC) over F1 score and accuracy in binary classification evaluation," BMC Genomics, vol. 21, no. 1, p. 6, 2020.</w:t>
       </w:r>
     </w:p>
@@ -10382,6 +11256,9 @@
         <w:jc w:val="both"/>
       </w:pPr>
       <w:r>
+        <w:rPr>
+          <w:rFonts w:ascii="Aptos" w:hAnsi="Aptos"/>
+        </w:rPr>
         <w:t>[12] C. Elkan, "The foundations of cost-sensitive learning," in Proceedings of the 17th International Joint Conference on Artificial Intelligence (IJCAI), 2001, pp. 973–978.</w:t>
       </w:r>
     </w:p>
@@ -10391,6 +11268,9 @@
         <w:jc w:val="both"/>
       </w:pPr>
       <w:r>
+        <w:rPr>
+          <w:rFonts w:ascii="Aptos" w:hAnsi="Aptos"/>
+        </w:rPr>
         <w:t>[13] H. He and E. A. Garcia, "Learning from imbalanced data," IEEE Transactions on Knowledge and Data Engineering, vol. 21, no. 9, pp. 1263–1284, 2009.</w:t>
       </w:r>
     </w:p>
@@ -10400,6 +11280,9 @@
         <w:jc w:val="both"/>
       </w:pPr>
       <w:r>
+        <w:rPr>
+          <w:rFonts w:ascii="Aptos" w:hAnsi="Aptos"/>
+        </w:rPr>
         <w:t>[14] S. Richards et al., "Standards and guidelines for the interpretation of sequence variants: a joint consensus recommendation of the American College of Medical Genetics and Genomics and the Association for Molecular Pathology," Genetics in Medicine, vol. 17, no. 5, pp. 405–423, 2015.</w:t>
       </w:r>
     </w:p>
@@ -10409,6 +11292,9 @@
         <w:jc w:val="both"/>
       </w:pPr>
       <w:r>
+        <w:rPr>
+          <w:rFonts w:ascii="Aptos" w:hAnsi="Aptos"/>
+        </w:rPr>
         <w:t>[15] I. A. Adzhubei et al., "A method and server for predicting damaging missense mutations," Nature Methods, vol. 7, no. 4, pp. 248–249, 2010.</w:t>
       </w:r>
     </w:p>
@@ -10418,6 +11304,9 @@
         <w:jc w:val="both"/>
       </w:pPr>
       <w:r>
+        <w:rPr>
+          <w:rFonts w:ascii="Aptos" w:hAnsi="Aptos"/>
+        </w:rPr>
         <w:t>[16] M. Kircher et al., "A general framework for estimating the relative pathogenicity of human genetic variants," Nature Genetics, vol. 46, no. 3, pp. 310–315, 2014.</w:t>
       </w:r>
     </w:p>
@@ -10427,6 +11316,9 @@
         <w:jc w:val="both"/>
       </w:pPr>
       <w:r>
+        <w:rPr>
+          <w:rFonts w:ascii="Aptos" w:hAnsi="Aptos"/>
+        </w:rPr>
         <w:t>[17] N. M. Ioannidis et al., "REVEL: An ensemble method for predicting the pathogenicity of rare missense variants," The American Journal of Human Genetics, vol. 99, no. 4, pp. 877–885, 2016.</w:t>
       </w:r>
     </w:p>
@@ -10436,6 +11328,9 @@
         <w:jc w:val="both"/>
       </w:pPr>
       <w:r>
+        <w:rPr>
+          <w:rFonts w:ascii="Aptos" w:hAnsi="Aptos"/>
+        </w:rPr>
         <w:t>[18] J. Cheng et al., "Accurate proteome-wide missense variant effect prediction with AlphaMissense," Science, vol. 381, no. 6664, p. eadg7492, 2023.</w:t>
       </w:r>
     </w:p>
@@ -10445,6 +11340,9 @@
         <w:jc w:val="both"/>
       </w:pPr>
       <w:r>
+        <w:rPr>
+          <w:rFonts w:ascii="Aptos" w:hAnsi="Aptos"/>
+        </w:rPr>
         <w:t>[19] Z. Lin et al., "Evolutionary-scale prediction of atomic-level protein structure with a language model," Science, vol. 379, no. 6637, pp. 1123–1130, 2023.</w:t>
       </w:r>
     </w:p>
@@ -10454,6 +11352,9 @@
         <w:jc w:val="both"/>
       </w:pPr>
       <w:r>
+        <w:rPr>
+          <w:rFonts w:ascii="Aptos" w:hAnsi="Aptos"/>
+        </w:rPr>
         <w:t>[20] X. Liu, C. Li, C. Mou, Y. Dong, and Y. Tu, "dbNSFP v4: a comprehensive database of functional predictions and annotations for human nonsynonymous and splice-site SNPs," Bioinformatics, vol. 36, no. 16, pp. 4529–4530, 2020.</w:t>
       </w:r>
     </w:p>
@@ -10463,6 +11364,9 @@
         <w:jc w:val="both"/>
       </w:pPr>
       <w:r>
+        <w:rPr>
+          <w:rFonts w:ascii="Aptos" w:hAnsi="Aptos"/>
+        </w:rPr>
         <w:t>[21] J. Zhou et al., "Deep learning-based predictive modeling of clinical outcomes using high-dimensional genomic data," Briefings in Bioinformatics, vol. 22, no. 4, pp. bbaa255, 2021.</w:t>
       </w:r>
     </w:p>
@@ -10472,6 +11376,9 @@
         <w:jc w:val="both"/>
       </w:pPr>
       <w:r>
+        <w:rPr>
+          <w:rFonts w:ascii="Aptos" w:hAnsi="Aptos"/>
+        </w:rPr>
         <w:br w:type="page"/>
       </w:r>
     </w:p>
@@ -10487,6 +11394,7 @@
       </w:pPr>
       <w:r>
         <w:rPr>
+          <w:rFonts w:ascii="Aptos" w:hAnsi="Aptos"/>
           <w:b/>
           <w:bCs/>
           <w:noProof/>
@@ -14441,6 +15349,10 @@
   <w:style w:type="paragraph" w:default="1" w:styleId="Normal">
     <w:name w:val="Normal"/>
     <w:qFormat/>
+    <w:rPr>
+      <w:rFonts w:ascii="Aptos" w:hAnsi="Aptos"/>
+      <w:sz w:val="22"/>
+    </w:rPr>
   </w:style>
   <w:style w:type="paragraph" w:styleId="Heading1">
     <w:name w:val="heading 1"/>

</xml_diff>